<commit_message>
change Docx template + update .gitignore
</commit_message>
<xml_diff>
--- a/sqlite/Cloudhands Report Demo.docx
+++ b/sqlite/Cloudhands Report Demo.docx
@@ -1,6 +1,6 @@
 
 <file path=word/document.xml><?xml version="1.0" encoding="utf-8"?>
-<w:document xmlns:wpc="http://schemas.microsoft.com/office/word/2010/wordprocessingCanvas" xmlns:cx="http://schemas.microsoft.com/office/drawing/2014/chartex" xmlns:cx1="http://schemas.microsoft.com/office/drawing/2015/9/8/chartex" xmlns:cx2="http://schemas.microsoft.com/office/drawing/2015/10/21/chartex" xmlns:cx3="http://schemas.microsoft.com/office/drawing/2016/5/9/chartex" xmlns:cx4="http://schemas.microsoft.com/office/drawing/2016/5/10/chartex" xmlns:cx5="http://schemas.microsoft.com/office/drawing/2016/5/11/chartex" xmlns:cx6="http://schemas.microsoft.com/office/drawing/2016/5/12/chartex" xmlns:cx7="http://schemas.microsoft.com/office/drawing/2016/5/13/chartex" xmlns:cx8="http://schemas.microsoft.com/office/drawing/2016/5/14/chartex" xmlns:mc="http://schemas.openxmlformats.org/markup-compatibility/2006" xmlns:aink="http://schemas.microsoft.com/office/drawing/2016/ink" xmlns:am3d="http://schemas.microsoft.com/office/drawing/2017/model3d" xmlns:o="urn:schemas-microsoft-com:office:office" xmlns:r="http://schemas.openxmlformats.org/officeDocument/2006/relationships" xmlns:m="http://schemas.openxmlformats.org/officeDocument/2006/math" xmlns:v="urn:schemas-microsoft-com:vml" xmlns:wp14="http://schemas.microsoft.com/office/word/2010/wordprocessingDrawing" xmlns:wp="http://schemas.openxmlformats.org/drawingml/2006/wordprocessingDrawing" xmlns:w10="urn:schemas-microsoft-com:office:word" xmlns:w="http://schemas.openxmlformats.org/wordprocessingml/2006/main" xmlns:w14="http://schemas.microsoft.com/office/word/2010/wordml" xmlns:w15="http://schemas.microsoft.com/office/word/2012/wordml" xmlns:w16cex="http://schemas.microsoft.com/office/word/2018/wordml/cex" xmlns:w16cid="http://schemas.microsoft.com/office/word/2016/wordml/cid" xmlns:w16="http://schemas.microsoft.com/office/word/2018/wordml" xmlns:w16sdtdh="http://schemas.microsoft.com/office/word/2020/wordml/sdtdatahash" xmlns:w16se="http://schemas.microsoft.com/office/word/2015/wordml/symex" xmlns:wpg="http://schemas.microsoft.com/office/word/2010/wordprocessingGroup" xmlns:wpi="http://schemas.microsoft.com/office/word/2010/wordprocessingInk" xmlns:wne="http://schemas.microsoft.com/office/word/2006/wordml" xmlns:wps="http://schemas.microsoft.com/office/word/2010/wordprocessingShape" mc:Ignorable="w14 w15 w16se w16cid w16 w16cex w16sdtdh wp14">
+<w:document xmlns:wpc="http://schemas.microsoft.com/office/word/2010/wordprocessingCanvas" xmlns:cx="http://schemas.microsoft.com/office/drawing/2014/chartex" xmlns:cx1="http://schemas.microsoft.com/office/drawing/2015/9/8/chartex" xmlns:cx2="http://schemas.microsoft.com/office/drawing/2015/10/21/chartex" xmlns:cx3="http://schemas.microsoft.com/office/drawing/2016/5/9/chartex" xmlns:cx4="http://schemas.microsoft.com/office/drawing/2016/5/10/chartex" xmlns:cx5="http://schemas.microsoft.com/office/drawing/2016/5/11/chartex" xmlns:cx6="http://schemas.microsoft.com/office/drawing/2016/5/12/chartex" xmlns:cx7="http://schemas.microsoft.com/office/drawing/2016/5/13/chartex" xmlns:cx8="http://schemas.microsoft.com/office/drawing/2016/5/14/chartex" xmlns:mc="http://schemas.openxmlformats.org/markup-compatibility/2006" xmlns:aink="http://schemas.microsoft.com/office/drawing/2016/ink" xmlns:am3d="http://schemas.microsoft.com/office/drawing/2017/model3d" xmlns:o="urn:schemas-microsoft-com:office:office" xmlns:oel="http://schemas.microsoft.com/office/2019/extlst" xmlns:r="http://schemas.openxmlformats.org/officeDocument/2006/relationships" xmlns:m="http://schemas.openxmlformats.org/officeDocument/2006/math" xmlns:v="urn:schemas-microsoft-com:vml" xmlns:wp14="http://schemas.microsoft.com/office/word/2010/wordprocessingDrawing" xmlns:wp="http://schemas.openxmlformats.org/drawingml/2006/wordprocessingDrawing" xmlns:w10="urn:schemas-microsoft-com:office:word" xmlns:w="http://schemas.openxmlformats.org/wordprocessingml/2006/main" xmlns:w14="http://schemas.microsoft.com/office/word/2010/wordml" xmlns:w15="http://schemas.microsoft.com/office/word/2012/wordml" xmlns:w16cex="http://schemas.microsoft.com/office/word/2018/wordml/cex" xmlns:w16cid="http://schemas.microsoft.com/office/word/2016/wordml/cid" xmlns:w16="http://schemas.microsoft.com/office/word/2018/wordml" xmlns:w16du="http://schemas.microsoft.com/office/word/2023/wordml/word16du" xmlns:w16sdtdh="http://schemas.microsoft.com/office/word/2020/wordml/sdtdatahash" xmlns:w16sdtfl="http://schemas.microsoft.com/office/word/2024/wordml/sdtformatlock" xmlns:w16se="http://schemas.microsoft.com/office/word/2015/wordml/symex" xmlns:wpg="http://schemas.microsoft.com/office/word/2010/wordprocessingGroup" xmlns:wpi="http://schemas.microsoft.com/office/word/2010/wordprocessingInk" xmlns:wne="http://schemas.microsoft.com/office/word/2006/wordml" xmlns:wps="http://schemas.microsoft.com/office/word/2010/wordprocessingShape" mc:Ignorable="w14 w15 w16se w16cid w16 w16cex w16sdtdh w16sdtfl w16du wp14">
   <w:body>
     <w:tbl>
       <w:tblPr>
@@ -44,6 +44,11 @@
             <w:shd w:val="clear" w:color="auto" w:fill="8EAADB" w:themeFill="accent1" w:themeFillTint="99"/>
           </w:tcPr>
           <w:p>
+            <w:pPr>
+              <w:rPr>
+                <w:rFonts w:hint="eastAsia"/>
+              </w:rPr>
+            </w:pPr>
             <w:r>
               <w:rPr>
                 <w:rFonts w:ascii="微软雅黑" w:eastAsia="微软雅黑" w:hAnsi="微软雅黑"/>
@@ -55,7 +60,7 @@
                 <w:szCs w:val="20"/>
               </w:rPr>
               <w:drawing>
-                <wp:inline distT="0" distB="0" distL="0" distR="0" wp14:anchorId="278EE326" wp14:editId="269FA590">
+                <wp:inline distT="0" distB="0" distL="0" distR="0" wp14:anchorId="278EE326" wp14:editId="10EA273F">
                   <wp:extent cx="2618740" cy="1452880"/>
                   <wp:effectExtent l="0" t="0" r="0" b="0"/>
                   <wp:docPr id="2" name="Picture 2" descr="A picture containing text, businesscard&#10;&#10;Description automatically generated"/>
@@ -100,6 +105,9 @@
           <w:p>
             <w:pPr>
               <w:jc w:val="center"/>
+              <w:rPr>
+                <w:rFonts w:hint="eastAsia"/>
+              </w:rPr>
             </w:pPr>
             <w:r>
               <w:rPr>
@@ -185,7 +193,7 @@
               </w:tabs>
               <w:spacing w:line="320" w:lineRule="exact"/>
               <w:rPr>
-                <w:rFonts w:ascii="微软雅黑" w:eastAsia="微软雅黑" w:hAnsi="微软雅黑"/>
+                <w:rFonts w:ascii="微软雅黑" w:eastAsia="微软雅黑" w:hAnsi="微软雅黑" w:hint="eastAsia"/>
                 <w:color w:val="595959" w:themeColor="text1" w:themeTint="A6"/>
                 <w:sz w:val="25"/>
                 <w:szCs w:val="25"/>
@@ -200,7 +208,7 @@
               </w:tabs>
               <w:spacing w:line="320" w:lineRule="exact"/>
               <w:rPr>
-                <w:rFonts w:ascii="微软雅黑" w:eastAsia="微软雅黑" w:hAnsi="微软雅黑"/>
+                <w:rFonts w:ascii="微软雅黑" w:eastAsia="微软雅黑" w:hAnsi="微软雅黑" w:hint="eastAsia"/>
                 <w:b/>
                 <w:bCs/>
                 <w:color w:val="2F5496" w:themeColor="accent1" w:themeShade="BF"/>
@@ -265,7 +273,7 @@
               </w:tabs>
               <w:spacing w:line="320" w:lineRule="exact"/>
               <w:rPr>
-                <w:rFonts w:ascii="微软雅黑" w:eastAsia="微软雅黑" w:hAnsi="微软雅黑"/>
+                <w:rFonts w:ascii="微软雅黑" w:eastAsia="微软雅黑" w:hAnsi="微软雅黑" w:hint="eastAsia"/>
                 <w:color w:val="2F5496" w:themeColor="accent1" w:themeShade="BF"/>
                 <w:sz w:val="19"/>
                 <w:szCs w:val="19"/>
@@ -276,6 +284,28 @@
             <w:pPr>
               <w:snapToGrid w:val="0"/>
               <w:rPr>
+                <w:rFonts w:ascii="微软雅黑" w:eastAsia="等线" w:hAnsi="微软雅黑" w:hint="eastAsia"/>
+                <w:b/>
+                <w:bCs/>
+                <w:color w:val="2F5496" w:themeColor="accent1" w:themeShade="BF"/>
+                <w:sz w:val="19"/>
+                <w:szCs w:val="19"/>
+              </w:rPr>
+            </w:pPr>
+            <w:r>
+              <w:rPr>
+                <w:rFonts w:ascii="微软雅黑" w:eastAsia="等线" w:hAnsi="微软雅黑" w:hint="eastAsia"/>
+                <w:b/>
+                <w:bCs/>
+                <w:color w:val="2F5496" w:themeColor="accent1" w:themeShade="BF"/>
+                <w:sz w:val="19"/>
+                <w:szCs w:val="19"/>
+              </w:rPr>
+              <w:t>摘要：</w:t>
+            </w:r>
+            <w:proofErr w:type="gramStart"/>
+            <w:r>
+              <w:rPr>
                 <w:rFonts w:ascii="微软雅黑" w:eastAsia="等线" w:hAnsi="微软雅黑"/>
                 <w:b/>
                 <w:bCs/>
@@ -283,19 +313,21 @@
                 <w:sz w:val="19"/>
                 <w:szCs w:val="19"/>
               </w:rPr>
-            </w:pPr>
-            <w:r>
-              <w:rPr>
-                <w:rFonts w:ascii="微软雅黑" w:eastAsia="等线" w:hAnsi="微软雅黑" w:hint="eastAsia"/>
+              <w:t xml:space="preserve">{{ </w:t>
+            </w:r>
+            <w:proofErr w:type="spellStart"/>
+            <w:r>
+              <w:rPr>
+                <w:rFonts w:ascii="微软雅黑" w:eastAsia="等线" w:hAnsi="微软雅黑"/>
                 <w:b/>
                 <w:bCs/>
                 <w:color w:val="2F5496" w:themeColor="accent1" w:themeShade="BF"/>
                 <w:sz w:val="19"/>
                 <w:szCs w:val="19"/>
               </w:rPr>
-              <w:t>摘要：</w:t>
-            </w:r>
-            <w:proofErr w:type="gramStart"/>
+              <w:t>Report</w:t>
+            </w:r>
+            <w:proofErr w:type="gramEnd"/>
             <w:r>
               <w:rPr>
                 <w:rFonts w:ascii="微软雅黑" w:eastAsia="等线" w:hAnsi="微软雅黑"/>
@@ -305,9 +337,9 @@
                 <w:sz w:val="19"/>
                 <w:szCs w:val="19"/>
               </w:rPr>
-              <w:t xml:space="preserve">{{ </w:t>
-            </w:r>
-            <w:proofErr w:type="spellStart"/>
+              <w:t>_Summary</w:t>
+            </w:r>
+            <w:proofErr w:type="spellEnd"/>
             <w:r>
               <w:rPr>
                 <w:rFonts w:ascii="微软雅黑" w:eastAsia="等线" w:hAnsi="微软雅黑"/>
@@ -317,36 +349,15 @@
                 <w:sz w:val="19"/>
                 <w:szCs w:val="19"/>
               </w:rPr>
-              <w:t>Report</w:t>
-            </w:r>
-            <w:proofErr w:type="gramEnd"/>
-            <w:r>
-              <w:rPr>
-                <w:rFonts w:ascii="微软雅黑" w:eastAsia="等线" w:hAnsi="微软雅黑"/>
-                <w:b/>
-                <w:bCs/>
-                <w:color w:val="2F5496" w:themeColor="accent1" w:themeShade="BF"/>
-                <w:sz w:val="19"/>
-                <w:szCs w:val="19"/>
-              </w:rPr>
-              <w:t>_Summary</w:t>
-            </w:r>
-            <w:proofErr w:type="spellEnd"/>
-            <w:r>
-              <w:rPr>
-                <w:rFonts w:ascii="微软雅黑" w:eastAsia="等线" w:hAnsi="微软雅黑"/>
-                <w:b/>
-                <w:bCs/>
-                <w:color w:val="2F5496" w:themeColor="accent1" w:themeShade="BF"/>
-                <w:sz w:val="19"/>
-                <w:szCs w:val="19"/>
-              </w:rPr>
               <w:t xml:space="preserve"> }}</w:t>
             </w:r>
           </w:p>
           <w:p>
             <w:pPr>
               <w:snapToGrid w:val="0"/>
+              <w:rPr>
+                <w:rFonts w:hint="eastAsia"/>
+              </w:rPr>
             </w:pPr>
           </w:p>
         </w:tc>
@@ -388,7 +399,7 @@
               <w:spacing w:beforeLines="20" w:before="62" w:line="320" w:lineRule="exact"/>
               <w:jc w:val="right"/>
               <w:rPr>
-                <w:rFonts w:ascii="微软雅黑" w:eastAsia="微软雅黑" w:hAnsi="微软雅黑"/>
+                <w:rFonts w:ascii="微软雅黑" w:eastAsia="微软雅黑" w:hAnsi="微软雅黑" w:hint="eastAsia"/>
                 <w:b/>
                 <w:bCs/>
                 <w:color w:val="2F5496" w:themeColor="accent1" w:themeShade="BF"/>
@@ -417,7 +428,7 @@
               <w:spacing w:beforeLines="20" w:before="62" w:line="320" w:lineRule="exact"/>
               <w:jc w:val="right"/>
               <w:rPr>
-                <w:rFonts w:ascii="微软雅黑" w:eastAsia="微软雅黑" w:hAnsi="微软雅黑"/>
+                <w:rFonts w:ascii="微软雅黑" w:eastAsia="微软雅黑" w:hAnsi="微软雅黑" w:hint="eastAsia"/>
                 <w:b/>
                 <w:bCs/>
                 <w:color w:val="2F5496" w:themeColor="accent1" w:themeShade="BF"/>
@@ -437,7 +448,13 @@
               <w:t>与基本面摘要</w:t>
             </w:r>
           </w:p>
-          <w:p/>
+          <w:p>
+            <w:pPr>
+              <w:rPr>
+                <w:rFonts w:hint="eastAsia"/>
+              </w:rPr>
+            </w:pPr>
+          </w:p>
         </w:tc>
         <w:tc>
           <w:tcPr>
@@ -458,7 +475,7 @@
               </w:tabs>
               <w:spacing w:line="320" w:lineRule="exact"/>
               <w:rPr>
-                <w:rFonts w:ascii="微软雅黑" w:eastAsia="微软雅黑" w:hAnsi="微软雅黑"/>
+                <w:rFonts w:ascii="微软雅黑" w:eastAsia="微软雅黑" w:hAnsi="微软雅黑" w:hint="eastAsia"/>
                 <w:b/>
                 <w:bCs/>
                 <w:color w:val="595959" w:themeColor="text1" w:themeTint="A6"/>
@@ -475,15 +492,14 @@
               </w:tabs>
               <w:spacing w:line="320" w:lineRule="exact"/>
               <w:rPr>
-                <w:rFonts w:ascii="微软雅黑" w:eastAsia="微软雅黑" w:hAnsi="微软雅黑"/>
-                <w:b/>
-                <w:bCs/>
-                <w:color w:val="595959" w:themeColor="text1" w:themeTint="A6"/>
-                <w:sz w:val="19"/>
-                <w:szCs w:val="19"/>
-              </w:rPr>
-            </w:pPr>
-            <w:proofErr w:type="gramStart"/>
+                <w:rFonts w:ascii="微软雅黑" w:eastAsia="微软雅黑" w:hAnsi="微软雅黑" w:hint="eastAsia"/>
+                <w:b/>
+                <w:bCs/>
+                <w:color w:val="595959" w:themeColor="text1" w:themeTint="A6"/>
+                <w:sz w:val="19"/>
+                <w:szCs w:val="19"/>
+              </w:rPr>
+            </w:pPr>
             <w:r>
               <w:rPr>
                 <w:rFonts w:ascii="微软雅黑" w:eastAsia="微软雅黑" w:hAnsi="微软雅黑"/>
@@ -506,7 +522,6 @@
               </w:rPr>
               <w:t>Title</w:t>
             </w:r>
-            <w:proofErr w:type="gramEnd"/>
             <w:r>
               <w:rPr>
                 <w:rFonts w:ascii="微软雅黑" w:eastAsia="微软雅黑" w:hAnsi="微软雅黑"/>
@@ -549,7 +564,7 @@
               </w:tabs>
               <w:spacing w:line="320" w:lineRule="exact"/>
               <w:rPr>
-                <w:rFonts w:ascii="微软雅黑" w:eastAsia="微软雅黑" w:hAnsi="微软雅黑"/>
+                <w:rFonts w:ascii="微软雅黑" w:eastAsia="微软雅黑" w:hAnsi="微软雅黑" w:hint="eastAsia"/>
                 <w:b/>
                 <w:bCs/>
                 <w:color w:val="595959" w:themeColor="text1" w:themeTint="A6"/>
@@ -566,13 +581,12 @@
               </w:tabs>
               <w:spacing w:line="320" w:lineRule="exact"/>
               <w:rPr>
-                <w:rFonts w:ascii="微软雅黑" w:eastAsia="微软雅黑" w:hAnsi="微软雅黑"/>
-                <w:color w:val="595959" w:themeColor="text1" w:themeTint="A6"/>
-                <w:sz w:val="19"/>
-                <w:szCs w:val="19"/>
-              </w:rPr>
-            </w:pPr>
-            <w:proofErr w:type="gramStart"/>
+                <w:rFonts w:ascii="微软雅黑" w:eastAsia="微软雅黑" w:hAnsi="微软雅黑" w:hint="eastAsia"/>
+                <w:color w:val="595959" w:themeColor="text1" w:themeTint="A6"/>
+                <w:sz w:val="19"/>
+                <w:szCs w:val="19"/>
+              </w:rPr>
+            </w:pPr>
             <w:r>
               <w:rPr>
                 <w:rFonts w:ascii="微软雅黑" w:eastAsia="微软雅黑" w:hAnsi="微软雅黑"/>
@@ -591,7 +605,6 @@
               </w:rPr>
               <w:t>Content</w:t>
             </w:r>
-            <w:proofErr w:type="gramEnd"/>
             <w:r>
               <w:rPr>
                 <w:rFonts w:ascii="微软雅黑" w:eastAsia="微软雅黑" w:hAnsi="微软雅黑"/>
@@ -646,7 +659,7 @@
               </w:tabs>
               <w:spacing w:line="320" w:lineRule="exact"/>
               <w:rPr>
-                <w:rFonts w:ascii="微软雅黑" w:eastAsia="等线" w:hAnsi="微软雅黑"/>
+                <w:rFonts w:ascii="微软雅黑" w:eastAsia="等线" w:hAnsi="微软雅黑" w:hint="eastAsia"/>
                 <w:b/>
                 <w:bCs/>
                 <w:color w:val="595959" w:themeColor="text1" w:themeTint="A6"/>
@@ -663,15 +676,14 @@
               </w:tabs>
               <w:spacing w:line="320" w:lineRule="exact"/>
               <w:rPr>
-                <w:rFonts w:ascii="微软雅黑" w:eastAsia="微软雅黑" w:hAnsi="微软雅黑"/>
-                <w:b/>
-                <w:bCs/>
-                <w:color w:val="595959" w:themeColor="text1" w:themeTint="A6"/>
-                <w:sz w:val="19"/>
-                <w:szCs w:val="19"/>
-              </w:rPr>
-            </w:pPr>
-            <w:proofErr w:type="gramStart"/>
+                <w:rFonts w:ascii="微软雅黑" w:eastAsia="微软雅黑" w:hAnsi="微软雅黑" w:hint="eastAsia"/>
+                <w:b/>
+                <w:bCs/>
+                <w:color w:val="595959" w:themeColor="text1" w:themeTint="A6"/>
+                <w:sz w:val="19"/>
+                <w:szCs w:val="19"/>
+              </w:rPr>
+            </w:pPr>
             <w:r>
               <w:rPr>
                 <w:rFonts w:ascii="微软雅黑" w:eastAsia="微软雅黑" w:hAnsi="微软雅黑"/>
@@ -694,7 +706,6 @@
               </w:rPr>
               <w:t>Title</w:t>
             </w:r>
-            <w:proofErr w:type="gramEnd"/>
             <w:r>
               <w:rPr>
                 <w:rFonts w:ascii="微软雅黑" w:eastAsia="微软雅黑" w:hAnsi="微软雅黑"/>
@@ -737,7 +748,7 @@
               </w:tabs>
               <w:spacing w:line="320" w:lineRule="exact"/>
               <w:rPr>
-                <w:rFonts w:ascii="微软雅黑" w:eastAsia="微软雅黑" w:hAnsi="微软雅黑"/>
+                <w:rFonts w:ascii="微软雅黑" w:eastAsia="微软雅黑" w:hAnsi="微软雅黑" w:hint="eastAsia"/>
                 <w:b/>
                 <w:bCs/>
                 <w:color w:val="595959" w:themeColor="text1" w:themeTint="A6"/>
@@ -754,13 +765,12 @@
               </w:tabs>
               <w:spacing w:line="320" w:lineRule="exact"/>
               <w:rPr>
-                <w:rFonts w:ascii="微软雅黑" w:eastAsia="微软雅黑" w:hAnsi="微软雅黑"/>
-                <w:color w:val="595959" w:themeColor="text1" w:themeTint="A6"/>
-                <w:sz w:val="19"/>
-                <w:szCs w:val="19"/>
-              </w:rPr>
-            </w:pPr>
-            <w:proofErr w:type="gramStart"/>
+                <w:rFonts w:ascii="微软雅黑" w:eastAsia="微软雅黑" w:hAnsi="微软雅黑" w:hint="eastAsia"/>
+                <w:color w:val="595959" w:themeColor="text1" w:themeTint="A6"/>
+                <w:sz w:val="19"/>
+                <w:szCs w:val="19"/>
+              </w:rPr>
+            </w:pPr>
             <w:r>
               <w:rPr>
                 <w:rFonts w:ascii="微软雅黑" w:eastAsia="微软雅黑" w:hAnsi="微软雅黑"/>
@@ -779,7 +789,6 @@
               </w:rPr>
               <w:t>Content</w:t>
             </w:r>
-            <w:proofErr w:type="gramEnd"/>
             <w:r>
               <w:rPr>
                 <w:rFonts w:ascii="微软雅黑" w:eastAsia="微软雅黑" w:hAnsi="微软雅黑"/>
@@ -816,7 +825,7 @@
               </w:tabs>
               <w:spacing w:line="320" w:lineRule="exact"/>
               <w:rPr>
-                <w:rFonts w:ascii="微软雅黑" w:eastAsia="等线" w:hAnsi="微软雅黑"/>
+                <w:rFonts w:ascii="微软雅黑" w:eastAsia="等线" w:hAnsi="微软雅黑" w:hint="eastAsia"/>
                 <w:b/>
                 <w:bCs/>
                 <w:color w:val="595959" w:themeColor="text1" w:themeTint="A6"/>
@@ -833,15 +842,14 @@
               </w:tabs>
               <w:spacing w:line="320" w:lineRule="exact"/>
               <w:rPr>
-                <w:rFonts w:ascii="微软雅黑" w:eastAsia="微软雅黑" w:hAnsi="微软雅黑"/>
-                <w:b/>
-                <w:bCs/>
-                <w:color w:val="595959" w:themeColor="text1" w:themeTint="A6"/>
-                <w:sz w:val="19"/>
-                <w:szCs w:val="19"/>
-              </w:rPr>
-            </w:pPr>
-            <w:proofErr w:type="gramStart"/>
+                <w:rFonts w:ascii="微软雅黑" w:eastAsia="微软雅黑" w:hAnsi="微软雅黑" w:hint="eastAsia"/>
+                <w:b/>
+                <w:bCs/>
+                <w:color w:val="595959" w:themeColor="text1" w:themeTint="A6"/>
+                <w:sz w:val="19"/>
+                <w:szCs w:val="19"/>
+              </w:rPr>
+            </w:pPr>
             <w:r>
               <w:rPr>
                 <w:rFonts w:ascii="微软雅黑" w:eastAsia="微软雅黑" w:hAnsi="微软雅黑"/>
@@ -864,7 +872,6 @@
               </w:rPr>
               <w:t>Title</w:t>
             </w:r>
-            <w:proofErr w:type="gramEnd"/>
             <w:r>
               <w:rPr>
                 <w:rFonts w:ascii="微软雅黑" w:eastAsia="微软雅黑" w:hAnsi="微软雅黑"/>
@@ -907,7 +914,7 @@
               </w:tabs>
               <w:spacing w:line="320" w:lineRule="exact"/>
               <w:rPr>
-                <w:rFonts w:ascii="微软雅黑" w:eastAsia="微软雅黑" w:hAnsi="微软雅黑"/>
+                <w:rFonts w:ascii="微软雅黑" w:eastAsia="微软雅黑" w:hAnsi="微软雅黑" w:hint="eastAsia"/>
                 <w:b/>
                 <w:bCs/>
                 <w:color w:val="595959" w:themeColor="text1" w:themeTint="A6"/>
@@ -924,13 +931,12 @@
               </w:tabs>
               <w:spacing w:line="320" w:lineRule="exact"/>
               <w:rPr>
-                <w:rFonts w:ascii="微软雅黑" w:eastAsia="微软雅黑" w:hAnsi="微软雅黑"/>
-                <w:color w:val="595959" w:themeColor="text1" w:themeTint="A6"/>
-                <w:sz w:val="19"/>
-                <w:szCs w:val="19"/>
-              </w:rPr>
-            </w:pPr>
-            <w:proofErr w:type="gramStart"/>
+                <w:rFonts w:ascii="微软雅黑" w:eastAsia="微软雅黑" w:hAnsi="微软雅黑" w:hint="eastAsia"/>
+                <w:color w:val="595959" w:themeColor="text1" w:themeTint="A6"/>
+                <w:sz w:val="19"/>
+                <w:szCs w:val="19"/>
+              </w:rPr>
+            </w:pPr>
             <w:r>
               <w:rPr>
                 <w:rFonts w:ascii="微软雅黑" w:eastAsia="微软雅黑" w:hAnsi="微软雅黑"/>
@@ -949,7 +955,6 @@
               </w:rPr>
               <w:t>Content</w:t>
             </w:r>
-            <w:proofErr w:type="gramEnd"/>
             <w:r>
               <w:rPr>
                 <w:rFonts w:ascii="微软雅黑" w:eastAsia="微软雅黑" w:hAnsi="微软雅黑"/>
@@ -978,7 +983,13 @@
               <w:t>_3 }}</w:t>
             </w:r>
           </w:p>
-          <w:p/>
+          <w:p>
+            <w:pPr>
+              <w:rPr>
+                <w:rFonts w:hint="eastAsia"/>
+              </w:rPr>
+            </w:pPr>
+          </w:p>
         </w:tc>
       </w:tr>
       <w:tr>
@@ -1017,7 +1028,7 @@
               <w:spacing w:line="320" w:lineRule="exact"/>
               <w:jc w:val="right"/>
               <w:rPr>
-                <w:rFonts w:ascii="微软雅黑" w:eastAsia="微软雅黑" w:hAnsi="微软雅黑"/>
+                <w:rFonts w:ascii="微软雅黑" w:eastAsia="微软雅黑" w:hAnsi="微软雅黑" w:hint="eastAsia"/>
                 <w:b/>
                 <w:bCs/>
                 <w:color w:val="2F5496" w:themeColor="accent1" w:themeShade="BF"/>
@@ -1045,7 +1056,7 @@
               <w:spacing w:line="320" w:lineRule="exact"/>
               <w:jc w:val="right"/>
               <w:rPr>
-                <w:rFonts w:ascii="微软雅黑" w:eastAsia="微软雅黑" w:hAnsi="微软雅黑"/>
+                <w:rFonts w:ascii="微软雅黑" w:eastAsia="微软雅黑" w:hAnsi="微软雅黑" w:hint="eastAsia"/>
                 <w:b/>
                 <w:bCs/>
                 <w:color w:val="2F5496" w:themeColor="accent1" w:themeShade="BF"/>
@@ -1080,12 +1091,18 @@
             <w:pPr>
               <w:spacing w:line="320" w:lineRule="exact"/>
               <w:rPr>
-                <w:rFonts w:ascii="微软雅黑" w:eastAsia="微软雅黑" w:hAnsi="微软雅黑"/>
-                <w:color w:val="595959" w:themeColor="text1" w:themeTint="A6"/>
-              </w:rPr>
-            </w:pPr>
-          </w:p>
-          <w:p/>
+                <w:rFonts w:ascii="微软雅黑" w:eastAsia="微软雅黑" w:hAnsi="微软雅黑" w:hint="eastAsia"/>
+                <w:color w:val="595959" w:themeColor="text1" w:themeTint="A6"/>
+              </w:rPr>
+            </w:pPr>
+          </w:p>
+          <w:p>
+            <w:pPr>
+              <w:rPr>
+                <w:rFonts w:hint="eastAsia"/>
+              </w:rPr>
+            </w:pPr>
+          </w:p>
         </w:tc>
         <w:tc>
           <w:tcPr>
@@ -1106,7 +1123,7 @@
               </w:tabs>
               <w:spacing w:line="320" w:lineRule="exact"/>
               <w:rPr>
-                <w:rFonts w:ascii="微软雅黑" w:eastAsia="微软雅黑" w:hAnsi="微软雅黑"/>
+                <w:rFonts w:ascii="微软雅黑" w:eastAsia="微软雅黑" w:hAnsi="微软雅黑" w:hint="eastAsia"/>
                 <w:b/>
                 <w:bCs/>
                 <w:color w:val="595959" w:themeColor="text1" w:themeTint="A6"/>
@@ -1123,7 +1140,7 @@
               </w:tabs>
               <w:spacing w:line="320" w:lineRule="exact"/>
               <w:rPr>
-                <w:rFonts w:ascii="微软雅黑" w:eastAsia="微软雅黑" w:hAnsi="微软雅黑"/>
+                <w:rFonts w:ascii="微软雅黑" w:eastAsia="微软雅黑" w:hAnsi="微软雅黑" w:hint="eastAsia"/>
                 <w:b/>
                 <w:bCs/>
                 <w:color w:val="595959" w:themeColor="text1" w:themeTint="A6"/>
@@ -1151,7 +1168,7 @@
               </w:tabs>
               <w:spacing w:line="320" w:lineRule="exact"/>
               <w:rPr>
-                <w:rFonts w:ascii="微软雅黑" w:eastAsia="微软雅黑" w:hAnsi="微软雅黑"/>
+                <w:rFonts w:ascii="微软雅黑" w:eastAsia="微软雅黑" w:hAnsi="微软雅黑" w:hint="eastAsia"/>
                 <w:color w:val="595959" w:themeColor="text1" w:themeTint="A6"/>
                 <w:sz w:val="19"/>
                 <w:szCs w:val="19"/>
@@ -1166,7 +1183,7 @@
               </w:tabs>
               <w:spacing w:line="320" w:lineRule="exact"/>
               <w:rPr>
-                <w:rFonts w:ascii="微软雅黑" w:eastAsia="微软雅黑" w:hAnsi="微软雅黑"/>
+                <w:rFonts w:ascii="微软雅黑" w:eastAsia="微软雅黑" w:hAnsi="微软雅黑" w:hint="eastAsia"/>
                 <w:color w:val="595959" w:themeColor="text1" w:themeTint="A6"/>
                 <w:sz w:val="19"/>
                 <w:szCs w:val="19"/>
@@ -1181,7 +1198,7 @@
               </w:tabs>
               <w:spacing w:line="320" w:lineRule="exact"/>
               <w:rPr>
-                <w:rFonts w:ascii="微软雅黑" w:eastAsia="微软雅黑" w:hAnsi="微软雅黑"/>
+                <w:rFonts w:ascii="微软雅黑" w:eastAsia="微软雅黑" w:hAnsi="微软雅黑" w:hint="eastAsia"/>
                 <w:color w:val="595959" w:themeColor="text1" w:themeTint="A6"/>
                 <w:sz w:val="19"/>
                 <w:szCs w:val="19"/>
@@ -1196,7 +1213,7 @@
               </w:tabs>
               <w:spacing w:line="320" w:lineRule="exact"/>
               <w:rPr>
-                <w:rFonts w:ascii="微软雅黑" w:eastAsia="微软雅黑" w:hAnsi="微软雅黑"/>
+                <w:rFonts w:ascii="微软雅黑" w:eastAsia="微软雅黑" w:hAnsi="微软雅黑" w:hint="eastAsia"/>
                 <w:color w:val="595959" w:themeColor="text1" w:themeTint="A6"/>
                 <w:sz w:val="19"/>
                 <w:szCs w:val="19"/>
@@ -1211,7 +1228,7 @@
               </w:tabs>
               <w:spacing w:line="320" w:lineRule="exact"/>
               <w:rPr>
-                <w:rFonts w:ascii="微软雅黑" w:eastAsia="微软雅黑" w:hAnsi="微软雅黑"/>
+                <w:rFonts w:ascii="微软雅黑" w:eastAsia="微软雅黑" w:hAnsi="微软雅黑" w:hint="eastAsia"/>
                 <w:color w:val="595959" w:themeColor="text1" w:themeTint="A6"/>
                 <w:sz w:val="19"/>
                 <w:szCs w:val="19"/>
@@ -1226,7 +1243,7 @@
               </w:tabs>
               <w:spacing w:line="320" w:lineRule="exact"/>
               <w:rPr>
-                <w:rFonts w:ascii="微软雅黑" w:eastAsia="微软雅黑" w:hAnsi="微软雅黑"/>
+                <w:rFonts w:ascii="微软雅黑" w:eastAsia="微软雅黑" w:hAnsi="微软雅黑" w:hint="eastAsia"/>
                 <w:color w:val="595959" w:themeColor="text1" w:themeTint="A6"/>
                 <w:sz w:val="19"/>
                 <w:szCs w:val="19"/>
@@ -1241,7 +1258,7 @@
               </w:tabs>
               <w:spacing w:line="320" w:lineRule="exact"/>
               <w:rPr>
-                <w:rFonts w:ascii="微软雅黑" w:eastAsia="微软雅黑" w:hAnsi="微软雅黑"/>
+                <w:rFonts w:ascii="微软雅黑" w:eastAsia="微软雅黑" w:hAnsi="微软雅黑" w:hint="eastAsia"/>
                 <w:color w:val="595959" w:themeColor="text1" w:themeTint="A6"/>
                 <w:sz w:val="19"/>
                 <w:szCs w:val="19"/>
@@ -1256,7 +1273,7 @@
               </w:tabs>
               <w:spacing w:line="320" w:lineRule="exact"/>
               <w:rPr>
-                <w:rFonts w:ascii="微软雅黑" w:eastAsia="微软雅黑" w:hAnsi="微软雅黑"/>
+                <w:rFonts w:ascii="微软雅黑" w:eastAsia="微软雅黑" w:hAnsi="微软雅黑" w:hint="eastAsia"/>
                 <w:color w:val="595959" w:themeColor="text1" w:themeTint="A6"/>
                 <w:sz w:val="19"/>
                 <w:szCs w:val="19"/>
@@ -1271,7 +1288,7 @@
               </w:tabs>
               <w:spacing w:line="320" w:lineRule="exact"/>
               <w:rPr>
-                <w:rFonts w:ascii="微软雅黑" w:eastAsia="微软雅黑" w:hAnsi="微软雅黑"/>
+                <w:rFonts w:ascii="微软雅黑" w:eastAsia="微软雅黑" w:hAnsi="微软雅黑" w:hint="eastAsia"/>
                 <w:color w:val="595959" w:themeColor="text1" w:themeTint="A6"/>
                 <w:sz w:val="19"/>
                 <w:szCs w:val="19"/>
@@ -1286,7 +1303,7 @@
               </w:tabs>
               <w:spacing w:line="320" w:lineRule="exact"/>
               <w:rPr>
-                <w:rFonts w:ascii="微软雅黑" w:eastAsia="微软雅黑" w:hAnsi="微软雅黑"/>
+                <w:rFonts w:ascii="微软雅黑" w:eastAsia="微软雅黑" w:hAnsi="微软雅黑" w:hint="eastAsia"/>
                 <w:color w:val="595959" w:themeColor="text1" w:themeTint="A6"/>
                 <w:sz w:val="19"/>
                 <w:szCs w:val="19"/>
@@ -1301,7 +1318,7 @@
               </w:tabs>
               <w:spacing w:line="320" w:lineRule="exact"/>
               <w:rPr>
-                <w:rFonts w:ascii="微软雅黑" w:eastAsia="微软雅黑" w:hAnsi="微软雅黑"/>
+                <w:rFonts w:ascii="微软雅黑" w:eastAsia="微软雅黑" w:hAnsi="微软雅黑" w:hint="eastAsia"/>
                 <w:color w:val="595959" w:themeColor="text1" w:themeTint="A6"/>
                 <w:sz w:val="19"/>
                 <w:szCs w:val="19"/>
@@ -1316,13 +1333,12 @@
               </w:tabs>
               <w:spacing w:line="320" w:lineRule="exact"/>
               <w:rPr>
-                <w:rFonts w:ascii="微软雅黑" w:eastAsia="微软雅黑" w:hAnsi="微软雅黑"/>
-                <w:color w:val="595959" w:themeColor="text1" w:themeTint="A6"/>
-                <w:sz w:val="19"/>
-                <w:szCs w:val="19"/>
-              </w:rPr>
-            </w:pPr>
-            <w:proofErr w:type="gramStart"/>
+                <w:rFonts w:ascii="微软雅黑" w:eastAsia="微软雅黑" w:hAnsi="微软雅黑" w:hint="eastAsia"/>
+                <w:color w:val="595959" w:themeColor="text1" w:themeTint="A6"/>
+                <w:sz w:val="19"/>
+                <w:szCs w:val="19"/>
+              </w:rPr>
+            </w:pPr>
             <w:r>
               <w:rPr>
                 <w:rFonts w:ascii="微软雅黑" w:eastAsia="微软雅黑" w:hAnsi="微软雅黑"/>
@@ -1341,7 +1357,6 @@
               </w:rPr>
               <w:t>Picture</w:t>
             </w:r>
-            <w:proofErr w:type="gramEnd"/>
             <w:r>
               <w:rPr>
                 <w:rFonts w:ascii="微软雅黑" w:eastAsia="微软雅黑" w:hAnsi="微软雅黑" w:hint="eastAsia"/>
@@ -1378,7 +1393,7 @@
               </w:tabs>
               <w:spacing w:line="320" w:lineRule="exact"/>
               <w:rPr>
-                <w:rFonts w:ascii="微软雅黑" w:eastAsia="微软雅黑" w:hAnsi="微软雅黑"/>
+                <w:rFonts w:ascii="微软雅黑" w:eastAsia="微软雅黑" w:hAnsi="微软雅黑" w:hint="eastAsia"/>
                 <w:color w:val="595959" w:themeColor="text1" w:themeTint="A6"/>
                 <w:sz w:val="19"/>
                 <w:szCs w:val="19"/>
@@ -1414,7 +1429,13 @@
               <w:right w:val="nil"/>
             </w:tcBorders>
           </w:tcPr>
-          <w:p/>
+          <w:p>
+            <w:pPr>
+              <w:rPr>
+                <w:rFonts w:hint="eastAsia"/>
+              </w:rPr>
+            </w:pPr>
+          </w:p>
         </w:tc>
         <w:tc>
           <w:tcPr>
@@ -1435,6 +1456,33 @@
               </w:tabs>
               <w:spacing w:line="320" w:lineRule="exact"/>
               <w:rPr>
+                <w:rFonts w:ascii="微软雅黑" w:eastAsia="等线" w:hAnsi="微软雅黑" w:hint="eastAsia"/>
+                <w:b/>
+                <w:bCs/>
+                <w:color w:val="595959" w:themeColor="text1" w:themeTint="A6"/>
+                <w:sz w:val="19"/>
+                <w:szCs w:val="19"/>
+              </w:rPr>
+            </w:pPr>
+          </w:p>
+          <w:p>
+            <w:pPr>
+              <w:tabs>
+                <w:tab w:val="left" w:pos="3578"/>
+                <w:tab w:val="left" w:pos="6129"/>
+              </w:tabs>
+              <w:spacing w:line="320" w:lineRule="exact"/>
+              <w:rPr>
+                <w:rFonts w:ascii="微软雅黑" w:eastAsia="微软雅黑" w:hAnsi="微软雅黑" w:hint="eastAsia"/>
+                <w:b/>
+                <w:bCs/>
+                <w:color w:val="595959" w:themeColor="text1" w:themeTint="A6"/>
+                <w:sz w:val="19"/>
+                <w:szCs w:val="19"/>
+              </w:rPr>
+            </w:pPr>
+            <w:r>
+              <w:rPr>
                 <w:rFonts w:ascii="微软雅黑" w:eastAsia="等线" w:hAnsi="微软雅黑"/>
                 <w:b/>
                 <w:bCs/>
@@ -1442,6 +1490,32 @@
                 <w:sz w:val="19"/>
                 <w:szCs w:val="19"/>
               </w:rPr>
+              <w:t>2.2</w:t>
+            </w:r>
+            <w:r>
+              <w:rPr>
+                <w:rFonts w:ascii="微软雅黑" w:eastAsia="等线" w:hAnsi="微软雅黑" w:hint="eastAsia"/>
+                <w:b/>
+                <w:bCs/>
+                <w:color w:val="595959" w:themeColor="text1" w:themeTint="A6"/>
+                <w:sz w:val="19"/>
+                <w:szCs w:val="19"/>
+              </w:rPr>
+              <w:t>、期货市场头寸分析</w:t>
+            </w:r>
+          </w:p>
+          <w:p>
+            <w:pPr>
+              <w:tabs>
+                <w:tab w:val="left" w:pos="6129"/>
+              </w:tabs>
+              <w:spacing w:line="320" w:lineRule="exact"/>
+              <w:rPr>
+                <w:rFonts w:ascii="微软雅黑" w:eastAsia="微软雅黑" w:hAnsi="微软雅黑" w:hint="eastAsia"/>
+                <w:color w:val="595959" w:themeColor="text1" w:themeTint="A6"/>
+                <w:sz w:val="19"/>
+                <w:szCs w:val="19"/>
+              </w:rPr>
             </w:pPr>
           </w:p>
           <w:p>
@@ -1452,9 +1526,217 @@
               </w:tabs>
               <w:spacing w:line="320" w:lineRule="exact"/>
               <w:rPr>
-                <w:rFonts w:ascii="微软雅黑" w:eastAsia="微软雅黑" w:hAnsi="微软雅黑"/>
-                <w:b/>
-                <w:bCs/>
+                <w:rFonts w:ascii="微软雅黑" w:eastAsia="微软雅黑" w:hAnsi="微软雅黑" w:hint="eastAsia"/>
+                <w:color w:val="595959" w:themeColor="text1" w:themeTint="A6"/>
+                <w:sz w:val="19"/>
+                <w:szCs w:val="19"/>
+              </w:rPr>
+            </w:pPr>
+          </w:p>
+          <w:p>
+            <w:pPr>
+              <w:tabs>
+                <w:tab w:val="left" w:pos="3578"/>
+                <w:tab w:val="left" w:pos="6129"/>
+              </w:tabs>
+              <w:spacing w:line="320" w:lineRule="exact"/>
+              <w:rPr>
+                <w:rFonts w:ascii="微软雅黑" w:eastAsia="微软雅黑" w:hAnsi="微软雅黑" w:hint="eastAsia"/>
+                <w:color w:val="595959" w:themeColor="text1" w:themeTint="A6"/>
+                <w:sz w:val="19"/>
+                <w:szCs w:val="19"/>
+              </w:rPr>
+            </w:pPr>
+          </w:p>
+          <w:p>
+            <w:pPr>
+              <w:tabs>
+                <w:tab w:val="left" w:pos="3578"/>
+                <w:tab w:val="left" w:pos="6129"/>
+              </w:tabs>
+              <w:spacing w:line="320" w:lineRule="exact"/>
+              <w:rPr>
+                <w:rFonts w:ascii="微软雅黑" w:eastAsia="微软雅黑" w:hAnsi="微软雅黑" w:hint="eastAsia"/>
+                <w:color w:val="595959" w:themeColor="text1" w:themeTint="A6"/>
+                <w:sz w:val="19"/>
+                <w:szCs w:val="19"/>
+              </w:rPr>
+            </w:pPr>
+          </w:p>
+          <w:p>
+            <w:pPr>
+              <w:tabs>
+                <w:tab w:val="left" w:pos="3578"/>
+                <w:tab w:val="left" w:pos="6129"/>
+              </w:tabs>
+              <w:spacing w:line="320" w:lineRule="exact"/>
+              <w:rPr>
+                <w:rFonts w:ascii="微软雅黑" w:eastAsia="微软雅黑" w:hAnsi="微软雅黑" w:hint="eastAsia"/>
+                <w:color w:val="595959" w:themeColor="text1" w:themeTint="A6"/>
+                <w:sz w:val="19"/>
+                <w:szCs w:val="19"/>
+              </w:rPr>
+            </w:pPr>
+          </w:p>
+          <w:p>
+            <w:pPr>
+              <w:tabs>
+                <w:tab w:val="left" w:pos="3578"/>
+                <w:tab w:val="left" w:pos="6129"/>
+              </w:tabs>
+              <w:spacing w:line="320" w:lineRule="exact"/>
+              <w:rPr>
+                <w:rFonts w:ascii="微软雅黑" w:eastAsia="微软雅黑" w:hAnsi="微软雅黑" w:hint="eastAsia"/>
+                <w:color w:val="595959" w:themeColor="text1" w:themeTint="A6"/>
+                <w:sz w:val="19"/>
+                <w:szCs w:val="19"/>
+              </w:rPr>
+            </w:pPr>
+          </w:p>
+          <w:p>
+            <w:pPr>
+              <w:tabs>
+                <w:tab w:val="left" w:pos="3578"/>
+                <w:tab w:val="left" w:pos="6129"/>
+              </w:tabs>
+              <w:spacing w:line="320" w:lineRule="exact"/>
+              <w:rPr>
+                <w:rFonts w:ascii="微软雅黑" w:eastAsia="微软雅黑" w:hAnsi="微软雅黑" w:hint="eastAsia"/>
+                <w:color w:val="595959" w:themeColor="text1" w:themeTint="A6"/>
+                <w:sz w:val="19"/>
+                <w:szCs w:val="19"/>
+              </w:rPr>
+            </w:pPr>
+          </w:p>
+          <w:p>
+            <w:pPr>
+              <w:tabs>
+                <w:tab w:val="left" w:pos="3578"/>
+                <w:tab w:val="left" w:pos="6129"/>
+              </w:tabs>
+              <w:spacing w:line="320" w:lineRule="exact"/>
+              <w:rPr>
+                <w:rFonts w:ascii="微软雅黑" w:eastAsia="微软雅黑" w:hAnsi="微软雅黑" w:hint="eastAsia"/>
+                <w:color w:val="595959" w:themeColor="text1" w:themeTint="A6"/>
+                <w:sz w:val="19"/>
+                <w:szCs w:val="19"/>
+              </w:rPr>
+            </w:pPr>
+          </w:p>
+          <w:p>
+            <w:pPr>
+              <w:tabs>
+                <w:tab w:val="left" w:pos="3578"/>
+                <w:tab w:val="left" w:pos="6129"/>
+              </w:tabs>
+              <w:spacing w:line="320" w:lineRule="exact"/>
+              <w:rPr>
+                <w:rFonts w:ascii="微软雅黑" w:eastAsia="微软雅黑" w:hAnsi="微软雅黑" w:hint="eastAsia"/>
+                <w:color w:val="595959" w:themeColor="text1" w:themeTint="A6"/>
+                <w:sz w:val="19"/>
+                <w:szCs w:val="19"/>
+              </w:rPr>
+            </w:pPr>
+          </w:p>
+          <w:p>
+            <w:pPr>
+              <w:tabs>
+                <w:tab w:val="left" w:pos="3578"/>
+                <w:tab w:val="left" w:pos="6129"/>
+              </w:tabs>
+              <w:spacing w:line="320" w:lineRule="exact"/>
+              <w:rPr>
+                <w:rFonts w:ascii="微软雅黑" w:eastAsia="微软雅黑" w:hAnsi="微软雅黑" w:hint="eastAsia"/>
+                <w:color w:val="595959" w:themeColor="text1" w:themeTint="A6"/>
+                <w:sz w:val="19"/>
+                <w:szCs w:val="19"/>
+              </w:rPr>
+            </w:pPr>
+          </w:p>
+          <w:p>
+            <w:pPr>
+              <w:tabs>
+                <w:tab w:val="left" w:pos="3578"/>
+                <w:tab w:val="left" w:pos="6129"/>
+              </w:tabs>
+              <w:spacing w:line="320" w:lineRule="exact"/>
+              <w:rPr>
+                <w:rFonts w:ascii="微软雅黑" w:eastAsia="微软雅黑" w:hAnsi="微软雅黑" w:hint="eastAsia"/>
+                <w:color w:val="595959" w:themeColor="text1" w:themeTint="A6"/>
+                <w:sz w:val="19"/>
+                <w:szCs w:val="19"/>
+              </w:rPr>
+            </w:pPr>
+            <w:r>
+              <w:rPr>
+                <w:rFonts w:ascii="微软雅黑" w:eastAsia="微软雅黑" w:hAnsi="微软雅黑"/>
+                <w:color w:val="595959" w:themeColor="text1" w:themeTint="A6"/>
+                <w:sz w:val="19"/>
+                <w:szCs w:val="19"/>
+              </w:rPr>
+              <w:t xml:space="preserve">{{ </w:t>
+            </w:r>
+            <w:proofErr w:type="spellStart"/>
+            <w:r>
+              <w:rPr>
+                <w:rFonts w:ascii="微软雅黑" w:eastAsia="微软雅黑" w:hAnsi="微软雅黑"/>
+                <w:color w:val="595959" w:themeColor="text1" w:themeTint="A6"/>
+                <w:sz w:val="19"/>
+                <w:szCs w:val="19"/>
+              </w:rPr>
+              <w:t>Picture</w:t>
+            </w:r>
+            <w:r>
+              <w:rPr>
+                <w:rFonts w:ascii="微软雅黑" w:eastAsia="微软雅黑" w:hAnsi="微软雅黑"/>
+                <w:color w:val="595959" w:themeColor="text1" w:themeTint="A6"/>
+                <w:sz w:val="19"/>
+                <w:szCs w:val="19"/>
+              </w:rPr>
+              <w:t>_</w:t>
+            </w:r>
+            <w:r>
+              <w:rPr>
+                <w:rFonts w:ascii="微软雅黑" w:eastAsia="微软雅黑" w:hAnsi="微软雅黑"/>
+                <w:color w:val="595959" w:themeColor="text1" w:themeTint="A6"/>
+                <w:sz w:val="19"/>
+                <w:szCs w:val="19"/>
+              </w:rPr>
+              <w:t>Position</w:t>
+            </w:r>
+            <w:proofErr w:type="spellEnd"/>
+            <w:r>
+              <w:rPr>
+                <w:rFonts w:ascii="微软雅黑" w:eastAsia="微软雅黑" w:hAnsi="微软雅黑"/>
+                <w:color w:val="595959" w:themeColor="text1" w:themeTint="A6"/>
+                <w:sz w:val="19"/>
+                <w:szCs w:val="19"/>
+              </w:rPr>
+              <w:t xml:space="preserve"> }}</w:t>
+            </w:r>
+          </w:p>
+          <w:p>
+            <w:pPr>
+              <w:tabs>
+                <w:tab w:val="left" w:pos="6129"/>
+              </w:tabs>
+              <w:spacing w:line="320" w:lineRule="exact"/>
+              <w:rPr>
+                <w:rFonts w:ascii="微软雅黑" w:eastAsia="微软雅黑" w:hAnsi="微软雅黑" w:hint="eastAsia"/>
+                <w:color w:val="595959" w:themeColor="text1" w:themeTint="A6"/>
+                <w:sz w:val="19"/>
+                <w:szCs w:val="19"/>
+              </w:rPr>
+            </w:pPr>
+          </w:p>
+          <w:p>
+            <w:pPr>
+              <w:tabs>
+                <w:tab w:val="left" w:pos="6129"/>
+              </w:tabs>
+              <w:spacing w:line="320" w:lineRule="exact"/>
+              <w:rPr>
+                <w:rFonts w:ascii="微软雅黑" w:eastAsia="等线" w:hAnsi="微软雅黑" w:hint="eastAsia"/>
                 <w:color w:val="595959" w:themeColor="text1" w:themeTint="A6"/>
                 <w:sz w:val="19"/>
                 <w:szCs w:val="19"/>
@@ -1463,193 +1745,6 @@
             <w:r>
               <w:rPr>
                 <w:rFonts w:ascii="微软雅黑" w:eastAsia="等线" w:hAnsi="微软雅黑"/>
-                <w:b/>
-                <w:bCs/>
-                <w:color w:val="595959" w:themeColor="text1" w:themeTint="A6"/>
-                <w:sz w:val="19"/>
-                <w:szCs w:val="19"/>
-              </w:rPr>
-              <w:t>2.2</w:t>
-            </w:r>
-            <w:r>
-              <w:rPr>
-                <w:rFonts w:ascii="微软雅黑" w:eastAsia="等线" w:hAnsi="微软雅黑" w:hint="eastAsia"/>
-                <w:b/>
-                <w:bCs/>
-                <w:color w:val="595959" w:themeColor="text1" w:themeTint="A6"/>
-                <w:sz w:val="19"/>
-                <w:szCs w:val="19"/>
-              </w:rPr>
-              <w:t>、期货市场头寸分析</w:t>
-            </w:r>
-          </w:p>
-          <w:p>
-            <w:pPr>
-              <w:tabs>
-                <w:tab w:val="left" w:pos="6129"/>
-              </w:tabs>
-              <w:spacing w:line="320" w:lineRule="exact"/>
-              <w:rPr>
-                <w:rFonts w:ascii="微软雅黑" w:eastAsia="微软雅黑" w:hAnsi="微软雅黑"/>
-                <w:color w:val="595959" w:themeColor="text1" w:themeTint="A6"/>
-                <w:sz w:val="19"/>
-                <w:szCs w:val="19"/>
-              </w:rPr>
-            </w:pPr>
-          </w:p>
-          <w:p>
-            <w:pPr>
-              <w:tabs>
-                <w:tab w:val="left" w:pos="3578"/>
-                <w:tab w:val="left" w:pos="6129"/>
-              </w:tabs>
-              <w:spacing w:line="320" w:lineRule="exact"/>
-              <w:rPr>
-                <w:rFonts w:ascii="微软雅黑" w:eastAsia="微软雅黑" w:hAnsi="微软雅黑"/>
-                <w:color w:val="595959" w:themeColor="text1" w:themeTint="A6"/>
-                <w:sz w:val="19"/>
-                <w:szCs w:val="19"/>
-              </w:rPr>
-            </w:pPr>
-          </w:p>
-          <w:p>
-            <w:pPr>
-              <w:tabs>
-                <w:tab w:val="left" w:pos="3578"/>
-                <w:tab w:val="left" w:pos="6129"/>
-              </w:tabs>
-              <w:spacing w:line="320" w:lineRule="exact"/>
-              <w:rPr>
-                <w:rFonts w:ascii="微软雅黑" w:eastAsia="微软雅黑" w:hAnsi="微软雅黑"/>
-                <w:color w:val="595959" w:themeColor="text1" w:themeTint="A6"/>
-                <w:sz w:val="19"/>
-                <w:szCs w:val="19"/>
-              </w:rPr>
-            </w:pPr>
-          </w:p>
-          <w:p>
-            <w:pPr>
-              <w:tabs>
-                <w:tab w:val="left" w:pos="3578"/>
-                <w:tab w:val="left" w:pos="6129"/>
-              </w:tabs>
-              <w:spacing w:line="320" w:lineRule="exact"/>
-              <w:rPr>
-                <w:rFonts w:ascii="微软雅黑" w:eastAsia="微软雅黑" w:hAnsi="微软雅黑"/>
-                <w:color w:val="595959" w:themeColor="text1" w:themeTint="A6"/>
-                <w:sz w:val="19"/>
-                <w:szCs w:val="19"/>
-              </w:rPr>
-            </w:pPr>
-          </w:p>
-          <w:p>
-            <w:pPr>
-              <w:tabs>
-                <w:tab w:val="left" w:pos="3578"/>
-                <w:tab w:val="left" w:pos="6129"/>
-              </w:tabs>
-              <w:spacing w:line="320" w:lineRule="exact"/>
-              <w:rPr>
-                <w:rFonts w:ascii="微软雅黑" w:eastAsia="微软雅黑" w:hAnsi="微软雅黑"/>
-                <w:color w:val="595959" w:themeColor="text1" w:themeTint="A6"/>
-                <w:sz w:val="19"/>
-                <w:szCs w:val="19"/>
-              </w:rPr>
-            </w:pPr>
-          </w:p>
-          <w:p>
-            <w:pPr>
-              <w:tabs>
-                <w:tab w:val="left" w:pos="3578"/>
-                <w:tab w:val="left" w:pos="6129"/>
-              </w:tabs>
-              <w:spacing w:line="320" w:lineRule="exact"/>
-              <w:rPr>
-                <w:rFonts w:ascii="微软雅黑" w:eastAsia="微软雅黑" w:hAnsi="微软雅黑"/>
-                <w:color w:val="595959" w:themeColor="text1" w:themeTint="A6"/>
-                <w:sz w:val="19"/>
-                <w:szCs w:val="19"/>
-              </w:rPr>
-            </w:pPr>
-          </w:p>
-          <w:p>
-            <w:pPr>
-              <w:tabs>
-                <w:tab w:val="left" w:pos="3578"/>
-                <w:tab w:val="left" w:pos="6129"/>
-              </w:tabs>
-              <w:spacing w:line="320" w:lineRule="exact"/>
-              <w:rPr>
-                <w:rFonts w:ascii="微软雅黑" w:eastAsia="微软雅黑" w:hAnsi="微软雅黑"/>
-                <w:color w:val="595959" w:themeColor="text1" w:themeTint="A6"/>
-                <w:sz w:val="19"/>
-                <w:szCs w:val="19"/>
-              </w:rPr>
-            </w:pPr>
-          </w:p>
-          <w:p>
-            <w:pPr>
-              <w:tabs>
-                <w:tab w:val="left" w:pos="3578"/>
-                <w:tab w:val="left" w:pos="6129"/>
-              </w:tabs>
-              <w:spacing w:line="320" w:lineRule="exact"/>
-              <w:rPr>
-                <w:rFonts w:ascii="微软雅黑" w:eastAsia="微软雅黑" w:hAnsi="微软雅黑"/>
-                <w:color w:val="595959" w:themeColor="text1" w:themeTint="A6"/>
-                <w:sz w:val="19"/>
-                <w:szCs w:val="19"/>
-              </w:rPr>
-            </w:pPr>
-          </w:p>
-          <w:p>
-            <w:pPr>
-              <w:tabs>
-                <w:tab w:val="left" w:pos="3578"/>
-                <w:tab w:val="left" w:pos="6129"/>
-              </w:tabs>
-              <w:spacing w:line="320" w:lineRule="exact"/>
-              <w:rPr>
-                <w:rFonts w:ascii="微软雅黑" w:eastAsia="微软雅黑" w:hAnsi="微软雅黑"/>
-                <w:color w:val="595959" w:themeColor="text1" w:themeTint="A6"/>
-                <w:sz w:val="19"/>
-                <w:szCs w:val="19"/>
-              </w:rPr>
-            </w:pPr>
-          </w:p>
-          <w:p>
-            <w:pPr>
-              <w:tabs>
-                <w:tab w:val="left" w:pos="3578"/>
-                <w:tab w:val="left" w:pos="6129"/>
-              </w:tabs>
-              <w:spacing w:line="320" w:lineRule="exact"/>
-              <w:rPr>
-                <w:rFonts w:ascii="微软雅黑" w:eastAsia="微软雅黑" w:hAnsi="微软雅黑"/>
-                <w:color w:val="595959" w:themeColor="text1" w:themeTint="A6"/>
-                <w:sz w:val="19"/>
-                <w:szCs w:val="19"/>
-              </w:rPr>
-            </w:pPr>
-          </w:p>
-          <w:p>
-            <w:pPr>
-              <w:tabs>
-                <w:tab w:val="left" w:pos="3578"/>
-                <w:tab w:val="left" w:pos="6129"/>
-              </w:tabs>
-              <w:spacing w:line="320" w:lineRule="exact"/>
-              <w:rPr>
-                <w:rFonts w:ascii="微软雅黑" w:eastAsia="微软雅黑" w:hAnsi="微软雅黑"/>
-                <w:color w:val="595959" w:themeColor="text1" w:themeTint="A6"/>
-                <w:sz w:val="19"/>
-                <w:szCs w:val="19"/>
-              </w:rPr>
-            </w:pPr>
-            <w:proofErr w:type="gramStart"/>
-            <w:r>
-              <w:rPr>
-                <w:rFonts w:ascii="微软雅黑" w:eastAsia="微软雅黑" w:hAnsi="微软雅黑"/>
                 <w:color w:val="595959" w:themeColor="text1" w:themeTint="A6"/>
                 <w:sz w:val="19"/>
                 <w:szCs w:val="19"/>
@@ -1659,17 +1754,16 @@
             <w:proofErr w:type="spellStart"/>
             <w:r>
               <w:rPr>
-                <w:rFonts w:ascii="微软雅黑" w:eastAsia="微软雅黑" w:hAnsi="微软雅黑"/>
-                <w:color w:val="595959" w:themeColor="text1" w:themeTint="A6"/>
-                <w:sz w:val="19"/>
-                <w:szCs w:val="19"/>
-              </w:rPr>
-              <w:t>Picture</w:t>
-            </w:r>
-            <w:proofErr w:type="gramEnd"/>
-            <w:r>
-              <w:rPr>
-                <w:rFonts w:ascii="微软雅黑" w:eastAsia="微软雅黑" w:hAnsi="微软雅黑"/>
+                <w:rFonts w:ascii="微软雅黑" w:eastAsia="等线" w:hAnsi="微软雅黑"/>
+                <w:color w:val="595959" w:themeColor="text1" w:themeTint="A6"/>
+                <w:sz w:val="19"/>
+                <w:szCs w:val="19"/>
+              </w:rPr>
+              <w:t>Content</w:t>
+            </w:r>
+            <w:r>
+              <w:rPr>
+                <w:rFonts w:ascii="微软雅黑" w:eastAsia="等线" w:hAnsi="微软雅黑"/>
                 <w:color w:val="595959" w:themeColor="text1" w:themeTint="A6"/>
                 <w:sz w:val="19"/>
                 <w:szCs w:val="19"/>
@@ -1678,7 +1772,7 @@
             </w:r>
             <w:r>
               <w:rPr>
-                <w:rFonts w:ascii="微软雅黑" w:eastAsia="微软雅黑" w:hAnsi="微软雅黑"/>
+                <w:rFonts w:ascii="微软雅黑" w:eastAsia="等线" w:hAnsi="微软雅黑"/>
                 <w:color w:val="595959" w:themeColor="text1" w:themeTint="A6"/>
                 <w:sz w:val="19"/>
                 <w:szCs w:val="19"/>
@@ -1688,7 +1782,7 @@
             <w:proofErr w:type="spellEnd"/>
             <w:r>
               <w:rPr>
-                <w:rFonts w:ascii="微软雅黑" w:eastAsia="微软雅黑" w:hAnsi="微软雅黑"/>
+                <w:rFonts w:ascii="微软雅黑" w:eastAsia="等线" w:hAnsi="微软雅黑"/>
                 <w:color w:val="595959" w:themeColor="text1" w:themeTint="A6"/>
                 <w:sz w:val="19"/>
                 <w:szCs w:val="19"/>
@@ -1698,82 +1792,11 @@
           </w:p>
           <w:p>
             <w:pPr>
-              <w:tabs>
-                <w:tab w:val="left" w:pos="6129"/>
-              </w:tabs>
-              <w:spacing w:line="320" w:lineRule="exact"/>
-              <w:rPr>
-                <w:rFonts w:ascii="微软雅黑" w:eastAsia="微软雅黑" w:hAnsi="微软雅黑"/>
-                <w:color w:val="595959" w:themeColor="text1" w:themeTint="A6"/>
-                <w:sz w:val="19"/>
-                <w:szCs w:val="19"/>
-              </w:rPr>
-            </w:pPr>
-          </w:p>
-          <w:p>
-            <w:pPr>
-              <w:tabs>
-                <w:tab w:val="left" w:pos="6129"/>
-              </w:tabs>
-              <w:spacing w:line="320" w:lineRule="exact"/>
-              <w:rPr>
-                <w:rFonts w:ascii="微软雅黑" w:eastAsia="等线" w:hAnsi="微软雅黑"/>
-                <w:color w:val="595959" w:themeColor="text1" w:themeTint="A6"/>
-                <w:sz w:val="19"/>
-                <w:szCs w:val="19"/>
-              </w:rPr>
-            </w:pPr>
-            <w:proofErr w:type="gramStart"/>
-            <w:r>
-              <w:rPr>
-                <w:rFonts w:ascii="微软雅黑" w:eastAsia="等线" w:hAnsi="微软雅黑"/>
-                <w:color w:val="595959" w:themeColor="text1" w:themeTint="A6"/>
-                <w:sz w:val="19"/>
-                <w:szCs w:val="19"/>
-              </w:rPr>
-              <w:t xml:space="preserve">{{ </w:t>
-            </w:r>
-            <w:proofErr w:type="spellStart"/>
-            <w:r>
-              <w:rPr>
-                <w:rFonts w:ascii="微软雅黑" w:eastAsia="等线" w:hAnsi="微软雅黑"/>
-                <w:color w:val="595959" w:themeColor="text1" w:themeTint="A6"/>
-                <w:sz w:val="19"/>
-                <w:szCs w:val="19"/>
-              </w:rPr>
-              <w:t>Content</w:t>
-            </w:r>
-            <w:proofErr w:type="gramEnd"/>
-            <w:r>
-              <w:rPr>
-                <w:rFonts w:ascii="微软雅黑" w:eastAsia="等线" w:hAnsi="微软雅黑"/>
-                <w:color w:val="595959" w:themeColor="text1" w:themeTint="A6"/>
-                <w:sz w:val="19"/>
-                <w:szCs w:val="19"/>
-              </w:rPr>
-              <w:t>_</w:t>
-            </w:r>
-            <w:r>
-              <w:rPr>
-                <w:rFonts w:ascii="微软雅黑" w:eastAsia="等线" w:hAnsi="微软雅黑"/>
-                <w:color w:val="595959" w:themeColor="text1" w:themeTint="A6"/>
-                <w:sz w:val="19"/>
-                <w:szCs w:val="19"/>
-              </w:rPr>
-              <w:t>Position</w:t>
-            </w:r>
-            <w:proofErr w:type="spellEnd"/>
-            <w:r>
-              <w:rPr>
-                <w:rFonts w:ascii="微软雅黑" w:eastAsia="等线" w:hAnsi="微软雅黑"/>
-                <w:color w:val="595959" w:themeColor="text1" w:themeTint="A6"/>
-                <w:sz w:val="19"/>
-                <w:szCs w:val="19"/>
-              </w:rPr>
-              <w:t xml:space="preserve"> }}</w:t>
-            </w:r>
-          </w:p>
-          <w:p/>
+              <w:rPr>
+                <w:rFonts w:hint="eastAsia"/>
+              </w:rPr>
+            </w:pPr>
+          </w:p>
         </w:tc>
       </w:tr>
       <w:tr>
@@ -1803,7 +1826,13 @@
               <w:right w:val="nil"/>
             </w:tcBorders>
           </w:tcPr>
-          <w:p/>
+          <w:p>
+            <w:pPr>
+              <w:rPr>
+                <w:rFonts w:hint="eastAsia"/>
+              </w:rPr>
+            </w:pPr>
+          </w:p>
         </w:tc>
         <w:tc>
           <w:tcPr>
@@ -1824,6 +1853,32 @@
               </w:tabs>
               <w:spacing w:line="320" w:lineRule="exact"/>
               <w:rPr>
+                <w:rFonts w:ascii="微软雅黑" w:eastAsia="等线" w:hAnsi="微软雅黑" w:hint="eastAsia"/>
+                <w:b/>
+                <w:bCs/>
+                <w:color w:val="595959" w:themeColor="text1" w:themeTint="A6"/>
+                <w:sz w:val="19"/>
+                <w:szCs w:val="19"/>
+              </w:rPr>
+            </w:pPr>
+          </w:p>
+          <w:p>
+            <w:pPr>
+              <w:tabs>
+                <w:tab w:val="left" w:pos="6129"/>
+              </w:tabs>
+              <w:spacing w:line="320" w:lineRule="exact"/>
+              <w:rPr>
+                <w:rFonts w:ascii="微软雅黑" w:eastAsia="微软雅黑" w:hAnsi="微软雅黑" w:hint="eastAsia"/>
+                <w:b/>
+                <w:bCs/>
+                <w:color w:val="595959" w:themeColor="text1" w:themeTint="A6"/>
+                <w:sz w:val="19"/>
+                <w:szCs w:val="19"/>
+              </w:rPr>
+            </w:pPr>
+            <w:r>
+              <w:rPr>
                 <w:rFonts w:ascii="微软雅黑" w:eastAsia="等线" w:hAnsi="微软雅黑"/>
                 <w:b/>
                 <w:bCs/>
@@ -1831,18 +1886,109 @@
                 <w:sz w:val="19"/>
                 <w:szCs w:val="19"/>
               </w:rPr>
-            </w:pPr>
-          </w:p>
-          <w:p>
-            <w:pPr>
-              <w:tabs>
-                <w:tab w:val="left" w:pos="6129"/>
-              </w:tabs>
-              <w:spacing w:line="320" w:lineRule="exact"/>
-              <w:rPr>
-                <w:rFonts w:ascii="微软雅黑" w:eastAsia="微软雅黑" w:hAnsi="微软雅黑"/>
-                <w:b/>
-                <w:bCs/>
+              <w:t>2.3</w:t>
+            </w:r>
+            <w:r>
+              <w:rPr>
+                <w:rFonts w:ascii="微软雅黑" w:eastAsia="等线" w:hAnsi="微软雅黑" w:hint="eastAsia"/>
+                <w:b/>
+                <w:bCs/>
+                <w:color w:val="595959" w:themeColor="text1" w:themeTint="A6"/>
+                <w:sz w:val="19"/>
+                <w:szCs w:val="19"/>
+              </w:rPr>
+              <w:t>、重点货币对展望</w:t>
+            </w:r>
+          </w:p>
+          <w:p>
+            <w:pPr>
+              <w:tabs>
+                <w:tab w:val="left" w:pos="6129"/>
+              </w:tabs>
+              <w:spacing w:line="320" w:lineRule="exact"/>
+              <w:rPr>
+                <w:rFonts w:ascii="微软雅黑" w:eastAsia="等线" w:hAnsi="微软雅黑" w:hint="eastAsia"/>
+                <w:b/>
+                <w:bCs/>
+                <w:color w:val="595959" w:themeColor="text1" w:themeTint="A6"/>
+                <w:sz w:val="19"/>
+                <w:szCs w:val="19"/>
+              </w:rPr>
+            </w:pPr>
+          </w:p>
+          <w:p>
+            <w:pPr>
+              <w:tabs>
+                <w:tab w:val="left" w:pos="6129"/>
+              </w:tabs>
+              <w:spacing w:line="320" w:lineRule="exact"/>
+              <w:rPr>
+                <w:rFonts w:ascii="微软雅黑" w:eastAsia="等线" w:hAnsi="微软雅黑" w:hint="eastAsia"/>
+                <w:b/>
+                <w:bCs/>
+                <w:color w:val="595959" w:themeColor="text1" w:themeTint="A6"/>
+                <w:sz w:val="19"/>
+                <w:szCs w:val="19"/>
+              </w:rPr>
+            </w:pPr>
+            <w:r>
+              <w:rPr>
+                <w:rFonts w:ascii="微软雅黑" w:eastAsia="等线" w:hAnsi="微软雅黑" w:hint="eastAsia"/>
+                <w:b/>
+                <w:bCs/>
+                <w:color w:val="595959" w:themeColor="text1" w:themeTint="A6"/>
+                <w:sz w:val="19"/>
+                <w:szCs w:val="19"/>
+              </w:rPr>
+              <w:t>欧元</w:t>
+            </w:r>
+            <w:r>
+              <w:rPr>
+                <w:rFonts w:ascii="微软雅黑" w:eastAsia="等线" w:hAnsi="微软雅黑" w:hint="eastAsia"/>
+                <w:b/>
+                <w:bCs/>
+                <w:color w:val="595959" w:themeColor="text1" w:themeTint="A6"/>
+                <w:sz w:val="19"/>
+                <w:szCs w:val="19"/>
+              </w:rPr>
+              <w:t>/</w:t>
+            </w:r>
+            <w:r>
+              <w:rPr>
+                <w:rFonts w:ascii="微软雅黑" w:eastAsia="等线" w:hAnsi="微软雅黑" w:hint="eastAsia"/>
+                <w:b/>
+                <w:bCs/>
+                <w:color w:val="595959" w:themeColor="text1" w:themeTint="A6"/>
+                <w:sz w:val="19"/>
+                <w:szCs w:val="19"/>
+              </w:rPr>
+              <w:t>美元：</w:t>
+            </w:r>
+          </w:p>
+          <w:p>
+            <w:pPr>
+              <w:tabs>
+                <w:tab w:val="left" w:pos="6129"/>
+              </w:tabs>
+              <w:spacing w:line="320" w:lineRule="exact"/>
+              <w:rPr>
+                <w:rFonts w:ascii="微软雅黑" w:eastAsia="等线" w:hAnsi="微软雅黑" w:hint="eastAsia"/>
+                <w:b/>
+                <w:bCs/>
+                <w:color w:val="595959" w:themeColor="text1" w:themeTint="A6"/>
+                <w:sz w:val="19"/>
+                <w:szCs w:val="19"/>
+              </w:rPr>
+            </w:pPr>
+          </w:p>
+          <w:p>
+            <w:pPr>
+              <w:tabs>
+                <w:tab w:val="left" w:pos="6129"/>
+              </w:tabs>
+              <w:spacing w:line="320" w:lineRule="exact"/>
+              <w:rPr>
+                <w:rFonts w:ascii="微软雅黑" w:eastAsia="等线" w:hAnsi="微软雅黑" w:hint="eastAsia"/>
                 <w:color w:val="595959" w:themeColor="text1" w:themeTint="A6"/>
                 <w:sz w:val="19"/>
                 <w:szCs w:val="19"/>
@@ -1851,73 +1997,103 @@
             <w:r>
               <w:rPr>
                 <w:rFonts w:ascii="微软雅黑" w:eastAsia="等线" w:hAnsi="微软雅黑"/>
-                <w:b/>
-                <w:bCs/>
-                <w:color w:val="595959" w:themeColor="text1" w:themeTint="A6"/>
-                <w:sz w:val="19"/>
-                <w:szCs w:val="19"/>
-              </w:rPr>
-              <w:t>2.3</w:t>
-            </w:r>
-            <w:r>
-              <w:rPr>
-                <w:rFonts w:ascii="微软雅黑" w:eastAsia="等线" w:hAnsi="微软雅黑" w:hint="eastAsia"/>
-                <w:b/>
-                <w:bCs/>
-                <w:color w:val="595959" w:themeColor="text1" w:themeTint="A6"/>
-                <w:sz w:val="19"/>
-                <w:szCs w:val="19"/>
-              </w:rPr>
-              <w:t>、重点货币对展望</w:t>
-            </w:r>
-          </w:p>
-          <w:p>
-            <w:pPr>
-              <w:tabs>
-                <w:tab w:val="left" w:pos="6129"/>
-              </w:tabs>
-              <w:spacing w:line="320" w:lineRule="exact"/>
+                <w:color w:val="595959" w:themeColor="text1" w:themeTint="A6"/>
+                <w:sz w:val="19"/>
+                <w:szCs w:val="19"/>
+              </w:rPr>
+              <w:t xml:space="preserve">{{ </w:t>
+            </w:r>
+            <w:r>
               <w:rPr>
                 <w:rFonts w:ascii="微软雅黑" w:eastAsia="等线" w:hAnsi="微软雅黑"/>
-                <w:b/>
-                <w:bCs/>
-                <w:color w:val="595959" w:themeColor="text1" w:themeTint="A6"/>
-                <w:sz w:val="19"/>
-                <w:szCs w:val="19"/>
-              </w:rPr>
-            </w:pPr>
-          </w:p>
-          <w:p>
-            <w:pPr>
-              <w:tabs>
-                <w:tab w:val="left" w:pos="6129"/>
-              </w:tabs>
-              <w:spacing w:line="320" w:lineRule="exact"/>
+                <w:color w:val="595959" w:themeColor="text1" w:themeTint="A6"/>
+                <w:sz w:val="19"/>
+                <w:szCs w:val="19"/>
+              </w:rPr>
+              <w:t>Content</w:t>
+            </w:r>
+            <w:r>
               <w:rPr>
                 <w:rFonts w:ascii="微软雅黑" w:eastAsia="等线" w:hAnsi="微软雅黑"/>
-                <w:b/>
-                <w:bCs/>
-                <w:color w:val="595959" w:themeColor="text1" w:themeTint="A6"/>
-                <w:sz w:val="19"/>
-                <w:szCs w:val="19"/>
-              </w:rPr>
-            </w:pPr>
-            <w:r>
-              <w:rPr>
-                <w:rFonts w:ascii="微软雅黑" w:eastAsia="等线" w:hAnsi="微软雅黑" w:hint="eastAsia"/>
-                <w:b/>
-                <w:bCs/>
-                <w:color w:val="595959" w:themeColor="text1" w:themeTint="A6"/>
-                <w:sz w:val="19"/>
-                <w:szCs w:val="19"/>
-              </w:rPr>
-              <w:t>欧元</w:t>
-            </w:r>
-            <w:r>
-              <w:rPr>
-                <w:rFonts w:ascii="微软雅黑" w:eastAsia="等线" w:hAnsi="微软雅黑" w:hint="eastAsia"/>
-                <w:b/>
-                <w:bCs/>
+                <w:color w:val="595959" w:themeColor="text1" w:themeTint="A6"/>
+                <w:sz w:val="19"/>
+                <w:szCs w:val="19"/>
+              </w:rPr>
+              <w:t>_</w:t>
+            </w:r>
+            <w:r>
+              <w:rPr>
+                <w:rFonts w:ascii="微软雅黑" w:eastAsia="等线" w:hAnsi="微软雅黑"/>
+                <w:color w:val="595959" w:themeColor="text1" w:themeTint="A6"/>
+                <w:sz w:val="19"/>
+                <w:szCs w:val="19"/>
+              </w:rPr>
+              <w:t>Forecast</w:t>
+            </w:r>
+            <w:r>
+              <w:rPr>
+                <w:rFonts w:ascii="微软雅黑" w:eastAsia="等线" w:hAnsi="微软雅黑" w:hint="eastAsia"/>
+                <w:color w:val="595959" w:themeColor="text1" w:themeTint="A6"/>
+                <w:sz w:val="19"/>
+                <w:szCs w:val="19"/>
+              </w:rPr>
+              <w:t>_</w:t>
+            </w:r>
+            <w:r>
+              <w:rPr>
+                <w:rFonts w:ascii="微软雅黑" w:eastAsia="等线" w:hAnsi="微软雅黑"/>
+                <w:color w:val="595959" w:themeColor="text1" w:themeTint="A6"/>
+                <w:sz w:val="19"/>
+                <w:szCs w:val="19"/>
+              </w:rPr>
+              <w:t>1 }}</w:t>
+            </w:r>
+          </w:p>
+          <w:p>
+            <w:pPr>
+              <w:tabs>
+                <w:tab w:val="left" w:pos="6129"/>
+              </w:tabs>
+              <w:spacing w:line="320" w:lineRule="exact"/>
+              <w:rPr>
+                <w:rFonts w:ascii="微软雅黑" w:eastAsia="等线" w:hAnsi="微软雅黑" w:hint="eastAsia"/>
+                <w:b/>
+                <w:bCs/>
+                <w:color w:val="595959" w:themeColor="text1" w:themeTint="A6"/>
+                <w:sz w:val="19"/>
+                <w:szCs w:val="19"/>
+              </w:rPr>
+            </w:pPr>
+          </w:p>
+          <w:p>
+            <w:pPr>
+              <w:tabs>
+                <w:tab w:val="left" w:pos="6129"/>
+              </w:tabs>
+              <w:spacing w:line="320" w:lineRule="exact"/>
+              <w:rPr>
+                <w:rFonts w:ascii="微软雅黑" w:hAnsi="微软雅黑" w:hint="eastAsia"/>
+                <w:b/>
+                <w:color w:val="595959" w:themeColor="text1" w:themeTint="A6"/>
+                <w:sz w:val="19"/>
+                <w:szCs w:val="19"/>
+              </w:rPr>
+            </w:pPr>
+            <w:r>
+              <w:rPr>
+                <w:rFonts w:asciiTheme="minorEastAsia" w:hAnsiTheme="minorEastAsia" w:hint="eastAsia"/>
+                <w:b/>
+                <w:color w:val="595959" w:themeColor="text1" w:themeTint="A6"/>
+                <w:sz w:val="19"/>
+                <w:szCs w:val="19"/>
+                <w:lang w:eastAsia="zh-TW"/>
+              </w:rPr>
+              <w:t>英镑</w:t>
+            </w:r>
+            <w:r>
+              <w:rPr>
+                <w:rFonts w:ascii="微软雅黑" w:hAnsi="微软雅黑" w:hint="eastAsia"/>
+                <w:b/>
                 <w:color w:val="595959" w:themeColor="text1" w:themeTint="A6"/>
                 <w:sz w:val="19"/>
                 <w:szCs w:val="19"/>
@@ -1926,9 +2102,8 @@
             </w:r>
             <w:r>
               <w:rPr>
-                <w:rFonts w:ascii="微软雅黑" w:eastAsia="等线" w:hAnsi="微软雅黑" w:hint="eastAsia"/>
-                <w:b/>
-                <w:bCs/>
+                <w:rFonts w:ascii="微软雅黑" w:hAnsi="微软雅黑" w:hint="eastAsia"/>
+                <w:b/>
                 <w:color w:val="595959" w:themeColor="text1" w:themeTint="A6"/>
                 <w:sz w:val="19"/>
                 <w:szCs w:val="19"/>
@@ -1943,29 +2118,171 @@
               </w:tabs>
               <w:spacing w:line="320" w:lineRule="exact"/>
               <w:rPr>
+                <w:rFonts w:ascii="微软雅黑" w:eastAsia="PMingLiU" w:hAnsi="微软雅黑" w:hint="eastAsia"/>
+                <w:color w:val="595959" w:themeColor="text1" w:themeTint="A6"/>
+                <w:sz w:val="19"/>
+                <w:szCs w:val="19"/>
+                <w:lang w:eastAsia="zh-TW"/>
+              </w:rPr>
+            </w:pPr>
+          </w:p>
+          <w:p>
+            <w:pPr>
+              <w:tabs>
+                <w:tab w:val="left" w:pos="6129"/>
+              </w:tabs>
+              <w:spacing w:line="320" w:lineRule="exact"/>
+              <w:rPr>
+                <w:rFonts w:ascii="微软雅黑" w:hAnsi="微软雅黑" w:hint="eastAsia"/>
+                <w:color w:val="595959" w:themeColor="text1" w:themeTint="A6"/>
+                <w:sz w:val="19"/>
+                <w:szCs w:val="19"/>
+              </w:rPr>
+            </w:pPr>
+            <w:r>
+              <w:rPr>
+                <w:rFonts w:ascii="微软雅黑" w:hAnsi="微软雅黑"/>
+                <w:color w:val="595959" w:themeColor="text1" w:themeTint="A6"/>
+                <w:sz w:val="19"/>
+                <w:szCs w:val="19"/>
+              </w:rPr>
+              <w:t>{{ Content</w:t>
+            </w:r>
+            <w:r>
+              <w:rPr>
+                <w:rFonts w:ascii="微软雅黑" w:hAnsi="微软雅黑" w:hint="eastAsia"/>
+                <w:color w:val="595959" w:themeColor="text1" w:themeTint="A6"/>
+                <w:sz w:val="19"/>
+                <w:szCs w:val="19"/>
+              </w:rPr>
+              <w:t>_</w:t>
+            </w:r>
+            <w:r>
+              <w:rPr>
+                <w:rFonts w:ascii="微软雅黑" w:hAnsi="微软雅黑"/>
+                <w:color w:val="595959" w:themeColor="text1" w:themeTint="A6"/>
+                <w:sz w:val="19"/>
+                <w:szCs w:val="19"/>
+              </w:rPr>
+              <w:t>Forecast</w:t>
+            </w:r>
+            <w:r>
+              <w:rPr>
+                <w:rFonts w:ascii="微软雅黑" w:eastAsia="等线" w:hAnsi="微软雅黑" w:hint="eastAsia"/>
+                <w:color w:val="595959" w:themeColor="text1" w:themeTint="A6"/>
+                <w:sz w:val="19"/>
+                <w:szCs w:val="19"/>
+              </w:rPr>
+              <w:t>_</w:t>
+            </w:r>
+            <w:r>
+              <w:rPr>
+                <w:rFonts w:ascii="微软雅黑" w:hAnsi="微软雅黑"/>
+                <w:color w:val="595959" w:themeColor="text1" w:themeTint="A6"/>
+                <w:sz w:val="19"/>
+                <w:szCs w:val="19"/>
+              </w:rPr>
+              <w:t>2 }}</w:t>
+            </w:r>
+          </w:p>
+          <w:p>
+            <w:pPr>
+              <w:tabs>
+                <w:tab w:val="left" w:pos="6129"/>
+              </w:tabs>
+              <w:spacing w:line="320" w:lineRule="exact"/>
+              <w:rPr>
+                <w:rFonts w:ascii="微软雅黑" w:eastAsia="PMingLiU" w:hAnsi="微软雅黑" w:hint="eastAsia"/>
+                <w:color w:val="595959" w:themeColor="text1" w:themeTint="A6"/>
+                <w:sz w:val="19"/>
+                <w:szCs w:val="19"/>
+                <w:lang w:eastAsia="zh-TW"/>
+              </w:rPr>
+            </w:pPr>
+          </w:p>
+          <w:p>
+            <w:pPr>
+              <w:tabs>
+                <w:tab w:val="left" w:pos="6129"/>
+              </w:tabs>
+              <w:spacing w:line="320" w:lineRule="exact"/>
+              <w:rPr>
+                <w:rFonts w:ascii="微软雅黑" w:hAnsi="微软雅黑" w:hint="eastAsia"/>
+                <w:b/>
+                <w:color w:val="595959" w:themeColor="text1" w:themeTint="A6"/>
+                <w:sz w:val="19"/>
+                <w:szCs w:val="19"/>
+              </w:rPr>
+            </w:pPr>
+            <w:r>
+              <w:rPr>
+                <w:rFonts w:ascii="微软雅黑" w:hAnsi="微软雅黑" w:hint="eastAsia"/>
+                <w:b/>
+                <w:color w:val="595959" w:themeColor="text1" w:themeTint="A6"/>
+                <w:sz w:val="19"/>
+                <w:szCs w:val="19"/>
+              </w:rPr>
+              <w:t>澳元</w:t>
+            </w:r>
+            <w:r>
+              <w:rPr>
+                <w:rFonts w:ascii="微软雅黑" w:hAnsi="微软雅黑" w:hint="eastAsia"/>
+                <w:b/>
+                <w:color w:val="595959" w:themeColor="text1" w:themeTint="A6"/>
+                <w:sz w:val="19"/>
+                <w:szCs w:val="19"/>
+              </w:rPr>
+              <w:t>/</w:t>
+            </w:r>
+            <w:r>
+              <w:rPr>
+                <w:rFonts w:ascii="微软雅黑" w:hAnsi="微软雅黑" w:hint="eastAsia"/>
+                <w:b/>
+                <w:color w:val="595959" w:themeColor="text1" w:themeTint="A6"/>
+                <w:sz w:val="19"/>
+                <w:szCs w:val="19"/>
+              </w:rPr>
+              <w:t>美元</w:t>
+            </w:r>
+          </w:p>
+          <w:p>
+            <w:pPr>
+              <w:rPr>
+                <w:rFonts w:hint="eastAsia"/>
+              </w:rPr>
+            </w:pPr>
+          </w:p>
+          <w:p>
+            <w:pPr>
+              <w:tabs>
+                <w:tab w:val="left" w:pos="6129"/>
+              </w:tabs>
+              <w:spacing w:line="320" w:lineRule="exact"/>
+              <w:rPr>
+                <w:rFonts w:ascii="微软雅黑" w:eastAsia="等线" w:hAnsi="微软雅黑" w:hint="eastAsia"/>
+                <w:color w:val="595959" w:themeColor="text1" w:themeTint="A6"/>
+                <w:sz w:val="19"/>
+                <w:szCs w:val="19"/>
+              </w:rPr>
+            </w:pPr>
+            <w:r>
+              <w:rPr>
                 <w:rFonts w:ascii="微软雅黑" w:eastAsia="等线" w:hAnsi="微软雅黑"/>
-                <w:b/>
-                <w:bCs/>
-                <w:color w:val="595959" w:themeColor="text1" w:themeTint="A6"/>
-                <w:sz w:val="19"/>
-                <w:szCs w:val="19"/>
-              </w:rPr>
-            </w:pPr>
-          </w:p>
-          <w:p>
-            <w:pPr>
-              <w:tabs>
-                <w:tab w:val="left" w:pos="6129"/>
-              </w:tabs>
-              <w:spacing w:line="320" w:lineRule="exact"/>
+                <w:color w:val="595959" w:themeColor="text1" w:themeTint="A6"/>
+                <w:sz w:val="19"/>
+                <w:szCs w:val="19"/>
+              </w:rPr>
+              <w:t xml:space="preserve">{{ </w:t>
+            </w:r>
+            <w:r>
               <w:rPr>
                 <w:rFonts w:ascii="微软雅黑" w:eastAsia="等线" w:hAnsi="微软雅黑"/>
                 <w:color w:val="595959" w:themeColor="text1" w:themeTint="A6"/>
                 <w:sz w:val="19"/>
                 <w:szCs w:val="19"/>
               </w:rPr>
-            </w:pPr>
-            <w:proofErr w:type="gramStart"/>
+              <w:t>Content</w:t>
+            </w:r>
             <w:r>
               <w:rPr>
                 <w:rFonts w:ascii="微软雅黑" w:eastAsia="等线" w:hAnsi="微软雅黑"/>
@@ -1973,6 +2290,115 @@
                 <w:sz w:val="19"/>
                 <w:szCs w:val="19"/>
               </w:rPr>
+              <w:t>_</w:t>
+            </w:r>
+            <w:r>
+              <w:rPr>
+                <w:rFonts w:ascii="微软雅黑" w:eastAsia="等线" w:hAnsi="微软雅黑"/>
+                <w:color w:val="595959" w:themeColor="text1" w:themeTint="A6"/>
+                <w:sz w:val="19"/>
+                <w:szCs w:val="19"/>
+              </w:rPr>
+              <w:t>Forecast</w:t>
+            </w:r>
+            <w:r>
+              <w:rPr>
+                <w:rFonts w:ascii="微软雅黑" w:eastAsia="等线" w:hAnsi="微软雅黑" w:hint="eastAsia"/>
+                <w:color w:val="595959" w:themeColor="text1" w:themeTint="A6"/>
+                <w:sz w:val="19"/>
+                <w:szCs w:val="19"/>
+              </w:rPr>
+              <w:t>_</w:t>
+            </w:r>
+            <w:r>
+              <w:rPr>
+                <w:rFonts w:ascii="微软雅黑" w:eastAsia="等线" w:hAnsi="微软雅黑"/>
+                <w:color w:val="595959" w:themeColor="text1" w:themeTint="A6"/>
+                <w:sz w:val="19"/>
+                <w:szCs w:val="19"/>
+              </w:rPr>
+              <w:t>3 }}</w:t>
+            </w:r>
+          </w:p>
+          <w:p>
+            <w:pPr>
+              <w:rPr>
+                <w:rFonts w:hint="eastAsia"/>
+              </w:rPr>
+            </w:pPr>
+          </w:p>
+          <w:p>
+            <w:pPr>
+              <w:tabs>
+                <w:tab w:val="left" w:pos="6129"/>
+              </w:tabs>
+              <w:spacing w:line="320" w:lineRule="exact"/>
+              <w:rPr>
+                <w:rFonts w:ascii="微软雅黑" w:hAnsi="微软雅黑" w:hint="eastAsia"/>
+                <w:b/>
+                <w:color w:val="595959" w:themeColor="text1" w:themeTint="A6"/>
+                <w:sz w:val="19"/>
+                <w:szCs w:val="19"/>
+              </w:rPr>
+            </w:pPr>
+            <w:r>
+              <w:rPr>
+                <w:rFonts w:ascii="微软雅黑" w:hAnsi="微软雅黑" w:hint="eastAsia"/>
+                <w:b/>
+                <w:color w:val="595959" w:themeColor="text1" w:themeTint="A6"/>
+                <w:sz w:val="19"/>
+                <w:szCs w:val="19"/>
+              </w:rPr>
+              <w:t>美元</w:t>
+            </w:r>
+            <w:r>
+              <w:rPr>
+                <w:rFonts w:ascii="微软雅黑" w:hAnsi="微软雅黑" w:hint="eastAsia"/>
+                <w:b/>
+                <w:color w:val="595959" w:themeColor="text1" w:themeTint="A6"/>
+                <w:sz w:val="19"/>
+                <w:szCs w:val="19"/>
+              </w:rPr>
+              <w:t>/</w:t>
+            </w:r>
+            <w:r>
+              <w:rPr>
+                <w:rFonts w:ascii="微软雅黑" w:hAnsi="微软雅黑" w:hint="eastAsia"/>
+                <w:b/>
+                <w:color w:val="595959" w:themeColor="text1" w:themeTint="A6"/>
+                <w:sz w:val="19"/>
+                <w:szCs w:val="19"/>
+              </w:rPr>
+              <w:t>日元</w:t>
+            </w:r>
+          </w:p>
+          <w:p>
+            <w:pPr>
+              <w:rPr>
+                <w:rFonts w:hint="eastAsia"/>
+              </w:rPr>
+            </w:pPr>
+          </w:p>
+          <w:p>
+            <w:pPr>
+              <w:tabs>
+                <w:tab w:val="left" w:pos="6129"/>
+              </w:tabs>
+              <w:spacing w:line="320" w:lineRule="exact"/>
+              <w:rPr>
+                <w:rFonts w:ascii="微软雅黑" w:eastAsia="等线" w:hAnsi="微软雅黑" w:hint="eastAsia"/>
+                <w:color w:val="595959" w:themeColor="text1" w:themeTint="A6"/>
+                <w:sz w:val="19"/>
+                <w:szCs w:val="19"/>
+              </w:rPr>
+            </w:pPr>
+            <w:r>
+              <w:rPr>
+                <w:rFonts w:ascii="微软雅黑" w:eastAsia="等线" w:hAnsi="微软雅黑"/>
+                <w:color w:val="595959" w:themeColor="text1" w:themeTint="A6"/>
+                <w:sz w:val="19"/>
+                <w:szCs w:val="19"/>
+              </w:rPr>
               <w:t xml:space="preserve">{{ </w:t>
             </w:r>
             <w:r>
@@ -1984,7 +2410,6 @@
               </w:rPr>
               <w:t>Content</w:t>
             </w:r>
-            <w:proofErr w:type="gramEnd"/>
             <w:r>
               <w:rPr>
                 <w:rFonts w:ascii="微软雅黑" w:eastAsia="等线" w:hAnsi="微软雅黑"/>
@@ -2019,396 +2444,16 @@
                 <w:sz w:val="19"/>
                 <w:szCs w:val="19"/>
               </w:rPr>
-              <w:t>1 }}</w:t>
-            </w:r>
-          </w:p>
-          <w:p>
-            <w:pPr>
-              <w:tabs>
-                <w:tab w:val="left" w:pos="6129"/>
-              </w:tabs>
-              <w:spacing w:line="320" w:lineRule="exact"/>
-              <w:rPr>
-                <w:rFonts w:ascii="微软雅黑" w:eastAsia="等线" w:hAnsi="微软雅黑"/>
-                <w:b/>
-                <w:bCs/>
-                <w:color w:val="595959" w:themeColor="text1" w:themeTint="A6"/>
-                <w:sz w:val="19"/>
-                <w:szCs w:val="19"/>
-              </w:rPr>
-            </w:pPr>
-          </w:p>
-          <w:p>
-            <w:pPr>
-              <w:tabs>
-                <w:tab w:val="left" w:pos="6129"/>
-              </w:tabs>
-              <w:spacing w:line="320" w:lineRule="exact"/>
-              <w:rPr>
-                <w:rFonts w:ascii="微软雅黑" w:hAnsi="微软雅黑"/>
-                <w:b/>
-                <w:color w:val="595959" w:themeColor="text1" w:themeTint="A6"/>
-                <w:sz w:val="19"/>
-                <w:szCs w:val="19"/>
-              </w:rPr>
-            </w:pPr>
-            <w:r>
-              <w:rPr>
-                <w:rFonts w:asciiTheme="minorEastAsia" w:hAnsiTheme="minorEastAsia" w:hint="eastAsia"/>
-                <w:b/>
-                <w:color w:val="595959" w:themeColor="text1" w:themeTint="A6"/>
-                <w:sz w:val="19"/>
-                <w:szCs w:val="19"/>
-                <w:lang w:eastAsia="zh-TW"/>
-              </w:rPr>
-              <w:t>英镑</w:t>
-            </w:r>
-            <w:r>
-              <w:rPr>
-                <w:rFonts w:ascii="微软雅黑" w:hAnsi="微软雅黑" w:hint="eastAsia"/>
-                <w:b/>
-                <w:color w:val="595959" w:themeColor="text1" w:themeTint="A6"/>
-                <w:sz w:val="19"/>
-                <w:szCs w:val="19"/>
-              </w:rPr>
-              <w:t>/</w:t>
-            </w:r>
-            <w:r>
-              <w:rPr>
-                <w:rFonts w:ascii="微软雅黑" w:hAnsi="微软雅黑" w:hint="eastAsia"/>
-                <w:b/>
-                <w:color w:val="595959" w:themeColor="text1" w:themeTint="A6"/>
-                <w:sz w:val="19"/>
-                <w:szCs w:val="19"/>
-              </w:rPr>
-              <w:t>美元：</w:t>
-            </w:r>
-          </w:p>
-          <w:p>
-            <w:pPr>
-              <w:tabs>
-                <w:tab w:val="left" w:pos="6129"/>
-              </w:tabs>
-              <w:spacing w:line="320" w:lineRule="exact"/>
-              <w:rPr>
-                <w:rFonts w:ascii="微软雅黑" w:eastAsia="PMingLiU" w:hAnsi="微软雅黑"/>
-                <w:color w:val="595959" w:themeColor="text1" w:themeTint="A6"/>
-                <w:sz w:val="19"/>
-                <w:szCs w:val="19"/>
-                <w:lang w:eastAsia="zh-TW"/>
-              </w:rPr>
-            </w:pPr>
-          </w:p>
-          <w:p>
-            <w:pPr>
-              <w:tabs>
-                <w:tab w:val="left" w:pos="6129"/>
-              </w:tabs>
-              <w:spacing w:line="320" w:lineRule="exact"/>
-              <w:rPr>
-                <w:rFonts w:ascii="微软雅黑" w:hAnsi="微软雅黑"/>
-                <w:color w:val="595959" w:themeColor="text1" w:themeTint="A6"/>
-                <w:sz w:val="19"/>
-                <w:szCs w:val="19"/>
-              </w:rPr>
-            </w:pPr>
-            <w:proofErr w:type="gramStart"/>
-            <w:r>
-              <w:rPr>
-                <w:rFonts w:ascii="微软雅黑" w:hAnsi="微软雅黑"/>
-                <w:color w:val="595959" w:themeColor="text1" w:themeTint="A6"/>
-                <w:sz w:val="19"/>
-                <w:szCs w:val="19"/>
-              </w:rPr>
-              <w:t>{{ Content</w:t>
-            </w:r>
-            <w:proofErr w:type="gramEnd"/>
-            <w:r>
-              <w:rPr>
-                <w:rFonts w:ascii="微软雅黑" w:hAnsi="微软雅黑" w:hint="eastAsia"/>
-                <w:color w:val="595959" w:themeColor="text1" w:themeTint="A6"/>
-                <w:sz w:val="19"/>
-                <w:szCs w:val="19"/>
-              </w:rPr>
-              <w:t>_</w:t>
-            </w:r>
-            <w:r>
-              <w:rPr>
-                <w:rFonts w:ascii="微软雅黑" w:hAnsi="微软雅黑"/>
-                <w:color w:val="595959" w:themeColor="text1" w:themeTint="A6"/>
-                <w:sz w:val="19"/>
-                <w:szCs w:val="19"/>
-              </w:rPr>
-              <w:t>Forecast</w:t>
-            </w:r>
-            <w:r>
-              <w:rPr>
-                <w:rFonts w:ascii="微软雅黑" w:eastAsia="等线" w:hAnsi="微软雅黑" w:hint="eastAsia"/>
-                <w:color w:val="595959" w:themeColor="text1" w:themeTint="A6"/>
-                <w:sz w:val="19"/>
-                <w:szCs w:val="19"/>
-              </w:rPr>
-              <w:t>_</w:t>
-            </w:r>
-            <w:r>
-              <w:rPr>
-                <w:rFonts w:ascii="微软雅黑" w:hAnsi="微软雅黑"/>
-                <w:color w:val="595959" w:themeColor="text1" w:themeTint="A6"/>
-                <w:sz w:val="19"/>
-                <w:szCs w:val="19"/>
-              </w:rPr>
-              <w:t>2 }}</w:t>
-            </w:r>
-          </w:p>
-          <w:p>
-            <w:pPr>
-              <w:tabs>
-                <w:tab w:val="left" w:pos="6129"/>
-              </w:tabs>
-              <w:spacing w:line="320" w:lineRule="exact"/>
-              <w:rPr>
-                <w:rFonts w:ascii="微软雅黑" w:eastAsia="PMingLiU" w:hAnsi="微软雅黑"/>
-                <w:color w:val="595959" w:themeColor="text1" w:themeTint="A6"/>
-                <w:sz w:val="19"/>
-                <w:szCs w:val="19"/>
-                <w:lang w:eastAsia="zh-TW"/>
-              </w:rPr>
-            </w:pPr>
-          </w:p>
-          <w:p>
-            <w:pPr>
-              <w:tabs>
-                <w:tab w:val="left" w:pos="6129"/>
-              </w:tabs>
-              <w:spacing w:line="320" w:lineRule="exact"/>
-              <w:rPr>
-                <w:rFonts w:ascii="微软雅黑" w:hAnsi="微软雅黑"/>
-                <w:b/>
-                <w:color w:val="595959" w:themeColor="text1" w:themeTint="A6"/>
-                <w:sz w:val="19"/>
-                <w:szCs w:val="19"/>
-              </w:rPr>
-            </w:pPr>
-            <w:r>
-              <w:rPr>
-                <w:rFonts w:ascii="微软雅黑" w:hAnsi="微软雅黑" w:hint="eastAsia"/>
-                <w:b/>
-                <w:color w:val="595959" w:themeColor="text1" w:themeTint="A6"/>
-                <w:sz w:val="19"/>
-                <w:szCs w:val="19"/>
-              </w:rPr>
-              <w:t>澳元</w:t>
-            </w:r>
-            <w:r>
-              <w:rPr>
-                <w:rFonts w:ascii="微软雅黑" w:hAnsi="微软雅黑" w:hint="eastAsia"/>
-                <w:b/>
-                <w:color w:val="595959" w:themeColor="text1" w:themeTint="A6"/>
-                <w:sz w:val="19"/>
-                <w:szCs w:val="19"/>
-              </w:rPr>
-              <w:t>/</w:t>
-            </w:r>
-            <w:r>
-              <w:rPr>
-                <w:rFonts w:ascii="微软雅黑" w:hAnsi="微软雅黑" w:hint="eastAsia"/>
-                <w:b/>
-                <w:color w:val="595959" w:themeColor="text1" w:themeTint="A6"/>
-                <w:sz w:val="19"/>
-                <w:szCs w:val="19"/>
-              </w:rPr>
-              <w:t>美元</w:t>
-            </w:r>
-          </w:p>
-          <w:p/>
-          <w:p>
-            <w:pPr>
-              <w:tabs>
-                <w:tab w:val="left" w:pos="6129"/>
-              </w:tabs>
-              <w:spacing w:line="320" w:lineRule="exact"/>
-              <w:rPr>
-                <w:rFonts w:ascii="微软雅黑" w:eastAsia="等线" w:hAnsi="微软雅黑"/>
-                <w:color w:val="595959" w:themeColor="text1" w:themeTint="A6"/>
-                <w:sz w:val="19"/>
-                <w:szCs w:val="19"/>
-              </w:rPr>
-            </w:pPr>
-            <w:proofErr w:type="gramStart"/>
-            <w:r>
-              <w:rPr>
-                <w:rFonts w:ascii="微软雅黑" w:eastAsia="等线" w:hAnsi="微软雅黑"/>
-                <w:color w:val="595959" w:themeColor="text1" w:themeTint="A6"/>
-                <w:sz w:val="19"/>
-                <w:szCs w:val="19"/>
-              </w:rPr>
-              <w:t xml:space="preserve">{{ </w:t>
-            </w:r>
-            <w:r>
-              <w:rPr>
-                <w:rFonts w:ascii="微软雅黑" w:eastAsia="等线" w:hAnsi="微软雅黑"/>
-                <w:color w:val="595959" w:themeColor="text1" w:themeTint="A6"/>
-                <w:sz w:val="19"/>
-                <w:szCs w:val="19"/>
-              </w:rPr>
-              <w:t>Content</w:t>
-            </w:r>
-            <w:proofErr w:type="gramEnd"/>
-            <w:r>
-              <w:rPr>
-                <w:rFonts w:ascii="微软雅黑" w:eastAsia="等线" w:hAnsi="微软雅黑"/>
-                <w:color w:val="595959" w:themeColor="text1" w:themeTint="A6"/>
-                <w:sz w:val="19"/>
-                <w:szCs w:val="19"/>
-              </w:rPr>
-              <w:t>_</w:t>
-            </w:r>
-            <w:r>
-              <w:rPr>
-                <w:rFonts w:ascii="微软雅黑" w:eastAsia="等线" w:hAnsi="微软雅黑"/>
-                <w:color w:val="595959" w:themeColor="text1" w:themeTint="A6"/>
-                <w:sz w:val="19"/>
-                <w:szCs w:val="19"/>
-              </w:rPr>
-              <w:t>Forecast</w:t>
-            </w:r>
-            <w:r>
-              <w:rPr>
-                <w:rFonts w:ascii="微软雅黑" w:eastAsia="等线" w:hAnsi="微软雅黑" w:hint="eastAsia"/>
-                <w:color w:val="595959" w:themeColor="text1" w:themeTint="A6"/>
-                <w:sz w:val="19"/>
-                <w:szCs w:val="19"/>
-              </w:rPr>
-              <w:t>_</w:t>
-            </w:r>
-            <w:r>
-              <w:rPr>
-                <w:rFonts w:ascii="微软雅黑" w:eastAsia="等线" w:hAnsi="微软雅黑"/>
-                <w:color w:val="595959" w:themeColor="text1" w:themeTint="A6"/>
-                <w:sz w:val="19"/>
-                <w:szCs w:val="19"/>
-              </w:rPr>
-              <w:t>3 }}</w:t>
-            </w:r>
-          </w:p>
-          <w:p/>
-          <w:p>
-            <w:pPr>
-              <w:tabs>
-                <w:tab w:val="left" w:pos="6129"/>
-              </w:tabs>
-              <w:spacing w:line="320" w:lineRule="exact"/>
-              <w:rPr>
-                <w:rFonts w:ascii="微软雅黑" w:hAnsi="微软雅黑"/>
-                <w:b/>
-                <w:color w:val="595959" w:themeColor="text1" w:themeTint="A6"/>
-                <w:sz w:val="19"/>
-                <w:szCs w:val="19"/>
-              </w:rPr>
-            </w:pPr>
-            <w:r>
-              <w:rPr>
-                <w:rFonts w:ascii="微软雅黑" w:hAnsi="微软雅黑" w:hint="eastAsia"/>
-                <w:b/>
-                <w:color w:val="595959" w:themeColor="text1" w:themeTint="A6"/>
-                <w:sz w:val="19"/>
-                <w:szCs w:val="19"/>
-              </w:rPr>
-              <w:t>美元</w:t>
-            </w:r>
-            <w:r>
-              <w:rPr>
-                <w:rFonts w:ascii="微软雅黑" w:hAnsi="微软雅黑" w:hint="eastAsia"/>
-                <w:b/>
-                <w:color w:val="595959" w:themeColor="text1" w:themeTint="A6"/>
-                <w:sz w:val="19"/>
-                <w:szCs w:val="19"/>
-              </w:rPr>
-              <w:t>/</w:t>
-            </w:r>
-            <w:r>
-              <w:rPr>
-                <w:rFonts w:ascii="微软雅黑" w:hAnsi="微软雅黑" w:hint="eastAsia"/>
-                <w:b/>
-                <w:color w:val="595959" w:themeColor="text1" w:themeTint="A6"/>
-                <w:sz w:val="19"/>
-                <w:szCs w:val="19"/>
-              </w:rPr>
-              <w:t>日元</w:t>
-            </w:r>
-          </w:p>
-          <w:p/>
-          <w:p>
-            <w:pPr>
-              <w:tabs>
-                <w:tab w:val="left" w:pos="6129"/>
-              </w:tabs>
-              <w:spacing w:line="320" w:lineRule="exact"/>
-              <w:rPr>
-                <w:rFonts w:ascii="微软雅黑" w:eastAsia="等线" w:hAnsi="微软雅黑"/>
-                <w:color w:val="595959" w:themeColor="text1" w:themeTint="A6"/>
-                <w:sz w:val="19"/>
-                <w:szCs w:val="19"/>
-              </w:rPr>
-            </w:pPr>
-            <w:proofErr w:type="gramStart"/>
-            <w:r>
-              <w:rPr>
-                <w:rFonts w:ascii="微软雅黑" w:eastAsia="等线" w:hAnsi="微软雅黑"/>
-                <w:color w:val="595959" w:themeColor="text1" w:themeTint="A6"/>
-                <w:sz w:val="19"/>
-                <w:szCs w:val="19"/>
-              </w:rPr>
-              <w:t xml:space="preserve">{{ </w:t>
-            </w:r>
-            <w:r>
-              <w:rPr>
-                <w:rFonts w:ascii="微软雅黑" w:eastAsia="等线" w:hAnsi="微软雅黑"/>
-                <w:color w:val="595959" w:themeColor="text1" w:themeTint="A6"/>
-                <w:sz w:val="19"/>
-                <w:szCs w:val="19"/>
-              </w:rPr>
-              <w:t>Content</w:t>
-            </w:r>
-            <w:proofErr w:type="gramEnd"/>
-            <w:r>
-              <w:rPr>
-                <w:rFonts w:ascii="微软雅黑" w:eastAsia="等线" w:hAnsi="微软雅黑"/>
-                <w:color w:val="595959" w:themeColor="text1" w:themeTint="A6"/>
-                <w:sz w:val="19"/>
-                <w:szCs w:val="19"/>
-              </w:rPr>
-              <w:t>_</w:t>
-            </w:r>
-            <w:r>
-              <w:rPr>
-                <w:rFonts w:ascii="微软雅黑" w:eastAsia="等线" w:hAnsi="微软雅黑"/>
-                <w:color w:val="595959" w:themeColor="text1" w:themeTint="A6"/>
-                <w:sz w:val="19"/>
-                <w:szCs w:val="19"/>
-              </w:rPr>
-              <w:t>Forecast</w:t>
-            </w:r>
-            <w:r>
-              <w:rPr>
-                <w:rFonts w:ascii="微软雅黑" w:eastAsia="等线" w:hAnsi="微软雅黑" w:hint="eastAsia"/>
-                <w:color w:val="595959" w:themeColor="text1" w:themeTint="A6"/>
-                <w:sz w:val="19"/>
-                <w:szCs w:val="19"/>
-              </w:rPr>
-              <w:t>_</w:t>
-            </w:r>
-            <w:r>
-              <w:rPr>
-                <w:rFonts w:ascii="微软雅黑" w:eastAsia="等线" w:hAnsi="微软雅黑"/>
-                <w:color w:val="595959" w:themeColor="text1" w:themeTint="A6"/>
-                <w:sz w:val="19"/>
-                <w:szCs w:val="19"/>
-              </w:rPr>
               <w:t>4 }}</w:t>
             </w:r>
           </w:p>
-          <w:p/>
+          <w:p>
+            <w:pPr>
+              <w:rPr>
+                <w:rFonts w:hint="eastAsia"/>
+              </w:rPr>
+            </w:pPr>
+          </w:p>
         </w:tc>
       </w:tr>
       <w:tr>
@@ -2438,7 +2483,13 @@
               <w:right w:val="nil"/>
             </w:tcBorders>
           </w:tcPr>
-          <w:p/>
+          <w:p>
+            <w:pPr>
+              <w:rPr>
+                <w:rFonts w:hint="eastAsia"/>
+              </w:rPr>
+            </w:pPr>
+          </w:p>
         </w:tc>
         <w:tc>
           <w:tcPr>
@@ -2451,15 +2502,21 @@
               <w:right w:val="single" w:sz="24" w:space="0" w:color="C9C9C9" w:themeColor="accent3" w:themeTint="99"/>
             </w:tcBorders>
           </w:tcPr>
-          <w:p/>
-          <w:p>
-            <w:pPr>
-              <w:tabs>
-                <w:tab w:val="left" w:pos="6129"/>
-              </w:tabs>
-              <w:spacing w:line="320" w:lineRule="exact"/>
-              <w:rPr>
-                <w:rFonts w:ascii="微软雅黑" w:eastAsia="微软雅黑" w:hAnsi="微软雅黑"/>
+          <w:p>
+            <w:pPr>
+              <w:rPr>
+                <w:rFonts w:hint="eastAsia"/>
+              </w:rPr>
+            </w:pPr>
+          </w:p>
+          <w:p>
+            <w:pPr>
+              <w:tabs>
+                <w:tab w:val="left" w:pos="6129"/>
+              </w:tabs>
+              <w:spacing w:line="320" w:lineRule="exact"/>
+              <w:rPr>
+                <w:rFonts w:ascii="微软雅黑" w:eastAsia="微软雅黑" w:hAnsi="微软雅黑" w:hint="eastAsia"/>
                 <w:b/>
                 <w:bCs/>
                 <w:color w:val="595959" w:themeColor="text1" w:themeTint="A6"/>
@@ -2497,7 +2554,7 @@
               </w:tabs>
               <w:spacing w:line="320" w:lineRule="exact"/>
               <w:rPr>
-                <w:rFonts w:ascii="微软雅黑" w:eastAsia="微软雅黑" w:hAnsi="微软雅黑"/>
+                <w:rFonts w:ascii="微软雅黑" w:eastAsia="微软雅黑" w:hAnsi="微软雅黑" w:hint="eastAsia"/>
                 <w:b/>
                 <w:bCs/>
                 <w:color w:val="595959" w:themeColor="text1" w:themeTint="A6"/>
@@ -2524,26 +2581,38 @@
               </w:tabs>
               <w:spacing w:line="320" w:lineRule="exact"/>
               <w:rPr>
-                <w:rFonts w:ascii="微软雅黑" w:eastAsia="微软雅黑" w:hAnsi="微软雅黑"/>
-                <w:color w:val="595959" w:themeColor="text1" w:themeTint="A6"/>
-                <w:sz w:val="19"/>
-                <w:szCs w:val="19"/>
-              </w:rPr>
-            </w:pPr>
-          </w:p>
-          <w:p>
-            <w:pPr>
-              <w:tabs>
-                <w:tab w:val="left" w:pos="6129"/>
-              </w:tabs>
-              <w:spacing w:line="320" w:lineRule="exact"/>
+                <w:rFonts w:ascii="微软雅黑" w:eastAsia="微软雅黑" w:hAnsi="微软雅黑" w:hint="eastAsia"/>
+                <w:color w:val="595959" w:themeColor="text1" w:themeTint="A6"/>
+                <w:sz w:val="19"/>
+                <w:szCs w:val="19"/>
+              </w:rPr>
+            </w:pPr>
+          </w:p>
+          <w:p>
+            <w:pPr>
+              <w:tabs>
+                <w:tab w:val="left" w:pos="6129"/>
+              </w:tabs>
+              <w:spacing w:line="320" w:lineRule="exact"/>
+              <w:rPr>
+                <w:rFonts w:ascii="微软雅黑" w:eastAsia="等线" w:hAnsi="微软雅黑" w:hint="eastAsia"/>
+                <w:color w:val="595959" w:themeColor="text1" w:themeTint="A6"/>
+                <w:sz w:val="19"/>
+                <w:szCs w:val="19"/>
+              </w:rPr>
+            </w:pPr>
+            <w:r>
               <w:rPr>
                 <w:rFonts w:ascii="微软雅黑" w:eastAsia="等线" w:hAnsi="微软雅黑"/>
-                <w:color w:val="595959" w:themeColor="text1" w:themeTint="A6"/>
-                <w:sz w:val="19"/>
-                <w:szCs w:val="19"/>
-              </w:rPr>
-            </w:pPr>
+                <w:b/>
+                <w:bCs/>
+                <w:color w:val="595959" w:themeColor="text1" w:themeTint="A6"/>
+                <w:sz w:val="19"/>
+                <w:szCs w:val="19"/>
+              </w:rPr>
+              <w:t xml:space="preserve">{{ </w:t>
+            </w:r>
+            <w:proofErr w:type="spellStart"/>
             <w:r>
               <w:rPr>
                 <w:rFonts w:ascii="微软雅黑" w:eastAsia="等线" w:hAnsi="微软雅黑"/>
@@ -2553,25 +2622,74 @@
                 <w:sz w:val="19"/>
                 <w:szCs w:val="19"/>
               </w:rPr>
+              <w:t>Title</w:t>
+            </w:r>
+            <w:r>
+              <w:rPr>
+                <w:rFonts w:ascii="微软雅黑" w:eastAsia="等线" w:hAnsi="微软雅黑"/>
+                <w:b/>
+                <w:bCs/>
+                <w:color w:val="595959" w:themeColor="text1" w:themeTint="A6"/>
+                <w:sz w:val="19"/>
+                <w:szCs w:val="19"/>
+              </w:rPr>
+              <w:t>_</w:t>
+            </w:r>
+            <w:r>
+              <w:rPr>
+                <w:rFonts w:ascii="微软雅黑" w:eastAsia="等线" w:hAnsi="微软雅黑"/>
+                <w:b/>
+                <w:bCs/>
+                <w:color w:val="595959" w:themeColor="text1" w:themeTint="A6"/>
+                <w:sz w:val="19"/>
+                <w:szCs w:val="19"/>
+              </w:rPr>
+              <w:t>Strategy</w:t>
+            </w:r>
+            <w:proofErr w:type="spellEnd"/>
+            <w:r>
+              <w:rPr>
+                <w:rFonts w:ascii="微软雅黑" w:eastAsia="等线" w:hAnsi="微软雅黑"/>
+                <w:b/>
+                <w:bCs/>
+                <w:color w:val="595959" w:themeColor="text1" w:themeTint="A6"/>
+                <w:sz w:val="19"/>
+                <w:szCs w:val="19"/>
+              </w:rPr>
+              <w:t xml:space="preserve"> }}</w:t>
+            </w:r>
+            <w:r>
+              <w:rPr>
+                <w:rFonts w:ascii="微软雅黑" w:eastAsia="等线" w:hAnsi="微软雅黑" w:hint="eastAsia"/>
+                <w:b/>
+                <w:bCs/>
+                <w:color w:val="595959" w:themeColor="text1" w:themeTint="A6"/>
+                <w:sz w:val="19"/>
+                <w:szCs w:val="19"/>
+              </w:rPr>
+              <w:t>：</w:t>
+            </w:r>
+            <w:r>
+              <w:rPr>
+                <w:rFonts w:ascii="微软雅黑" w:eastAsia="等线" w:hAnsi="微软雅黑"/>
+                <w:color w:val="595959" w:themeColor="text1" w:themeTint="A6"/>
+                <w:sz w:val="19"/>
+                <w:szCs w:val="19"/>
+              </w:rPr>
               <w:t xml:space="preserve">{{ </w:t>
             </w:r>
-            <w:proofErr w:type="spellStart"/>
             <w:r>
               <w:rPr>
                 <w:rFonts w:ascii="微软雅黑" w:eastAsia="等线" w:hAnsi="微软雅黑"/>
-                <w:b/>
-                <w:bCs/>
-                <w:color w:val="595959" w:themeColor="text1" w:themeTint="A6"/>
-                <w:sz w:val="19"/>
-                <w:szCs w:val="19"/>
-              </w:rPr>
-              <w:t>Title</w:t>
+                <w:color w:val="595959" w:themeColor="text1" w:themeTint="A6"/>
+                <w:sz w:val="19"/>
+                <w:szCs w:val="19"/>
+              </w:rPr>
+              <w:t>Content</w:t>
             </w:r>
             <w:r>
               <w:rPr>
                 <w:rFonts w:ascii="微软雅黑" w:eastAsia="等线" w:hAnsi="微软雅黑"/>
-                <w:b/>
-                <w:bCs/>
                 <w:color w:val="595959" w:themeColor="text1" w:themeTint="A6"/>
                 <w:sz w:val="19"/>
                 <w:szCs w:val="19"/>
@@ -2581,102 +2699,31 @@
             <w:r>
               <w:rPr>
                 <w:rFonts w:ascii="微软雅黑" w:eastAsia="等线" w:hAnsi="微软雅黑"/>
-                <w:b/>
-                <w:bCs/>
                 <w:color w:val="595959" w:themeColor="text1" w:themeTint="A6"/>
                 <w:sz w:val="19"/>
                 <w:szCs w:val="19"/>
               </w:rPr>
               <w:t>Strategy</w:t>
             </w:r>
-            <w:proofErr w:type="spellEnd"/>
             <w:r>
               <w:rPr>
                 <w:rFonts w:ascii="微软雅黑" w:eastAsia="等线" w:hAnsi="微软雅黑"/>
-                <w:b/>
-                <w:bCs/>
                 <w:color w:val="595959" w:themeColor="text1" w:themeTint="A6"/>
                 <w:sz w:val="19"/>
                 <w:szCs w:val="19"/>
               </w:rPr>
               <w:t xml:space="preserve"> }}</w:t>
             </w:r>
-            <w:r>
-              <w:rPr>
-                <w:rFonts w:ascii="微软雅黑" w:eastAsia="等线" w:hAnsi="微软雅黑" w:hint="eastAsia"/>
-                <w:b/>
-                <w:bCs/>
-                <w:color w:val="595959" w:themeColor="text1" w:themeTint="A6"/>
-                <w:sz w:val="19"/>
-                <w:szCs w:val="19"/>
-              </w:rPr>
-              <w:t>：</w:t>
-            </w:r>
-            <w:r>
-              <w:rPr>
-                <w:rFonts w:ascii="微软雅黑" w:eastAsia="等线" w:hAnsi="微软雅黑"/>
-                <w:color w:val="595959" w:themeColor="text1" w:themeTint="A6"/>
-                <w:sz w:val="19"/>
-                <w:szCs w:val="19"/>
-              </w:rPr>
-              <w:t xml:space="preserve"> </w:t>
-            </w:r>
-            <w:proofErr w:type="gramStart"/>
-            <w:r>
-              <w:rPr>
-                <w:rFonts w:ascii="微软雅黑" w:eastAsia="等线" w:hAnsi="微软雅黑"/>
-                <w:color w:val="595959" w:themeColor="text1" w:themeTint="A6"/>
-                <w:sz w:val="19"/>
-                <w:szCs w:val="19"/>
-              </w:rPr>
-              <w:t xml:space="preserve">{{ </w:t>
-            </w:r>
-            <w:proofErr w:type="spellStart"/>
-            <w:r>
-              <w:rPr>
-                <w:rFonts w:ascii="微软雅黑" w:eastAsia="等线" w:hAnsi="微软雅黑"/>
-                <w:color w:val="595959" w:themeColor="text1" w:themeTint="A6"/>
-                <w:sz w:val="19"/>
-                <w:szCs w:val="19"/>
-              </w:rPr>
-              <w:t>Content</w:t>
-            </w:r>
-            <w:proofErr w:type="gramEnd"/>
-            <w:r>
-              <w:rPr>
-                <w:rFonts w:ascii="微软雅黑" w:eastAsia="等线" w:hAnsi="微软雅黑"/>
-                <w:color w:val="595959" w:themeColor="text1" w:themeTint="A6"/>
-                <w:sz w:val="19"/>
-                <w:szCs w:val="19"/>
-              </w:rPr>
-              <w:t>_</w:t>
-            </w:r>
-            <w:r>
-              <w:rPr>
-                <w:rFonts w:ascii="微软雅黑" w:eastAsia="等线" w:hAnsi="微软雅黑"/>
-                <w:color w:val="595959" w:themeColor="text1" w:themeTint="A6"/>
-                <w:sz w:val="19"/>
-                <w:szCs w:val="19"/>
-              </w:rPr>
-              <w:t>Strategy</w:t>
-            </w:r>
-            <w:proofErr w:type="spellEnd"/>
-            <w:r>
-              <w:rPr>
-                <w:rFonts w:ascii="微软雅黑" w:eastAsia="等线" w:hAnsi="微软雅黑"/>
-                <w:color w:val="595959" w:themeColor="text1" w:themeTint="A6"/>
-                <w:sz w:val="19"/>
-                <w:szCs w:val="19"/>
-              </w:rPr>
-              <w:t xml:space="preserve"> }}</w:t>
-            </w:r>
-          </w:p>
-          <w:p>
-            <w:pPr>
-              <w:tabs>
-                <w:tab w:val="left" w:pos="6129"/>
-              </w:tabs>
-              <w:spacing w:line="320" w:lineRule="exact"/>
+          </w:p>
+          <w:p>
+            <w:pPr>
+              <w:tabs>
+                <w:tab w:val="left" w:pos="6129"/>
+              </w:tabs>
+              <w:spacing w:line="320" w:lineRule="exact"/>
+              <w:rPr>
+                <w:rFonts w:hint="eastAsia"/>
+              </w:rPr>
             </w:pPr>
           </w:p>
         </w:tc>
@@ -2717,7 +2764,7 @@
               <w:spacing w:line="320" w:lineRule="exact"/>
               <w:jc w:val="right"/>
               <w:rPr>
-                <w:rFonts w:ascii="微软雅黑" w:eastAsia="微软雅黑" w:hAnsi="微软雅黑"/>
+                <w:rFonts w:ascii="微软雅黑" w:eastAsia="微软雅黑" w:hAnsi="微软雅黑" w:hint="eastAsia"/>
                 <w:b/>
                 <w:bCs/>
                 <w:color w:val="2F5496" w:themeColor="accent1" w:themeShade="BF"/>
@@ -2737,7 +2784,13 @@
               <w:t>后市重要观察指标</w:t>
             </w:r>
           </w:p>
-          <w:p/>
+          <w:p>
+            <w:pPr>
+              <w:rPr>
+                <w:rFonts w:hint="eastAsia"/>
+              </w:rPr>
+            </w:pPr>
+          </w:p>
         </w:tc>
         <w:tc>
           <w:tcPr>
@@ -2757,7 +2810,7 @@
               </w:tabs>
               <w:spacing w:line="320" w:lineRule="exact"/>
               <w:rPr>
-                <w:rFonts w:ascii="微软雅黑" w:eastAsia="微软雅黑" w:hAnsi="微软雅黑"/>
+                <w:rFonts w:ascii="微软雅黑" w:eastAsia="微软雅黑" w:hAnsi="微软雅黑" w:hint="eastAsia"/>
                 <w:color w:val="595959" w:themeColor="text1" w:themeTint="A6"/>
                 <w:sz w:val="19"/>
                 <w:szCs w:val="19"/>
@@ -2820,6 +2873,7 @@
               </w:tabs>
               <w:spacing w:line="320" w:lineRule="exact"/>
               <w:rPr>
+                <w:rFonts w:hint="eastAsia"/>
                 <w:noProof/>
               </w:rPr>
             </w:pPr>
@@ -2880,7 +2934,7 @@
               </w:tabs>
               <w:spacing w:line="320" w:lineRule="exact"/>
               <w:rPr>
-                <w:rFonts w:ascii="微软雅黑" w:eastAsia="微软雅黑" w:hAnsi="微软雅黑"/>
+                <w:rFonts w:ascii="微软雅黑" w:eastAsia="微软雅黑" w:hAnsi="微软雅黑" w:hint="eastAsia"/>
                 <w:color w:val="595959" w:themeColor="text1" w:themeTint="A6"/>
                 <w:sz w:val="19"/>
                 <w:szCs w:val="19"/>
@@ -2943,7 +2997,7 @@
               </w:tabs>
               <w:spacing w:line="320" w:lineRule="exact"/>
               <w:rPr>
-                <w:rFonts w:ascii="微软雅黑" w:eastAsia="微软雅黑" w:hAnsi="微软雅黑"/>
+                <w:rFonts w:ascii="微软雅黑" w:eastAsia="微软雅黑" w:hAnsi="微软雅黑" w:hint="eastAsia"/>
                 <w:color w:val="595959" w:themeColor="text1" w:themeTint="A6"/>
                 <w:sz w:val="19"/>
                 <w:szCs w:val="19"/>
@@ -2999,7 +3053,13 @@
               <w:t xml:space="preserve"> }}</w:t>
             </w:r>
           </w:p>
-          <w:p/>
+          <w:p>
+            <w:pPr>
+              <w:rPr>
+                <w:rFonts w:hint="eastAsia"/>
+              </w:rPr>
+            </w:pPr>
+          </w:p>
         </w:tc>
       </w:tr>
       <w:tr>
@@ -3037,7 +3097,7 @@
               <w:spacing w:line="320" w:lineRule="exact"/>
               <w:jc w:val="right"/>
               <w:rPr>
-                <w:rFonts w:ascii="微软雅黑" w:eastAsia="微软雅黑" w:hAnsi="微软雅黑"/>
+                <w:rFonts w:ascii="微软雅黑" w:eastAsia="微软雅黑" w:hAnsi="微软雅黑" w:hint="eastAsia"/>
                 <w:b/>
                 <w:bCs/>
                 <w:color w:val="2F5496" w:themeColor="accent1" w:themeShade="BF"/>
@@ -3054,7 +3114,7 @@
               <w:spacing w:line="320" w:lineRule="exact"/>
               <w:jc w:val="right"/>
               <w:rPr>
-                <w:rFonts w:ascii="微软雅黑" w:eastAsia="微软雅黑" w:hAnsi="微软雅黑"/>
+                <w:rFonts w:ascii="微软雅黑" w:eastAsia="微软雅黑" w:hAnsi="微软雅黑" w:hint="eastAsia"/>
                 <w:b/>
                 <w:bCs/>
                 <w:color w:val="2F5496" w:themeColor="accent1" w:themeShade="BF"/>
@@ -3077,7 +3137,7 @@
           <w:p>
             <w:pPr>
               <w:rPr>
-                <w:rFonts w:ascii="微软雅黑" w:eastAsia="微软雅黑" w:hAnsi="微软雅黑"/>
+                <w:rFonts w:ascii="微软雅黑" w:eastAsia="微软雅黑" w:hAnsi="微软雅黑" w:hint="eastAsia"/>
                 <w:sz w:val="20"/>
                 <w:szCs w:val="20"/>
               </w:rPr>
@@ -3095,7 +3155,13 @@
               <w:right w:val="single" w:sz="24" w:space="0" w:color="C9C9C9" w:themeColor="accent3" w:themeTint="99"/>
             </w:tcBorders>
           </w:tcPr>
-          <w:p/>
+          <w:p>
+            <w:pPr>
+              <w:rPr>
+                <w:rFonts w:hint="eastAsia"/>
+              </w:rPr>
+            </w:pPr>
+          </w:p>
           <w:p>
             <w:pPr>
               <w:tabs>
@@ -3104,11 +3170,10 @@
               </w:tabs>
               <w:spacing w:line="320" w:lineRule="exact"/>
               <w:rPr>
-                <w:rFonts w:ascii="微软雅黑" w:eastAsia="等线" w:hAnsi="微软雅黑"/>
-                <w:color w:val="595959" w:themeColor="text1" w:themeTint="A6"/>
-                <w:sz w:val="19"/>
-                <w:szCs w:val="19"/>
-                <w:lang w:eastAsia="zh-TW"/>
+                <w:rFonts w:ascii="微软雅黑" w:eastAsia="等线" w:hAnsi="微软雅黑" w:hint="eastAsia"/>
+                <w:color w:val="595959" w:themeColor="text1" w:themeTint="A6"/>
+                <w:sz w:val="19"/>
+                <w:szCs w:val="19"/>
               </w:rPr>
             </w:pPr>
             <w:r>
@@ -3149,11 +3214,10 @@
               </w:tabs>
               <w:spacing w:line="320" w:lineRule="exact"/>
               <w:rPr>
-                <w:rFonts w:ascii="微软雅黑" w:eastAsia="等线" w:hAnsi="微软雅黑"/>
-                <w:color w:val="595959" w:themeColor="text1" w:themeTint="A6"/>
-                <w:sz w:val="19"/>
-                <w:szCs w:val="19"/>
-                <w:lang w:eastAsia="zh-TW"/>
+                <w:rFonts w:ascii="微软雅黑" w:eastAsia="等线" w:hAnsi="微软雅黑" w:hint="eastAsia"/>
+                <w:color w:val="595959" w:themeColor="text1" w:themeTint="A6"/>
+                <w:sz w:val="19"/>
+                <w:szCs w:val="19"/>
               </w:rPr>
             </w:pPr>
           </w:p>
@@ -3165,11 +3229,10 @@
               </w:tabs>
               <w:spacing w:line="320" w:lineRule="exact"/>
               <w:rPr>
-                <w:rFonts w:ascii="微软雅黑" w:eastAsia="等线" w:hAnsi="微软雅黑"/>
-                <w:color w:val="595959" w:themeColor="text1" w:themeTint="A6"/>
-                <w:sz w:val="19"/>
-                <w:szCs w:val="19"/>
-                <w:lang w:eastAsia="zh-TW"/>
+                <w:rFonts w:ascii="微软雅黑" w:eastAsia="等线" w:hAnsi="微软雅黑" w:hint="eastAsia"/>
+                <w:color w:val="595959" w:themeColor="text1" w:themeTint="A6"/>
+                <w:sz w:val="19"/>
+                <w:szCs w:val="19"/>
               </w:rPr>
             </w:pPr>
             <w:r>
@@ -3262,11 +3325,23 @@
               <w:t>并不针对或意图向在该司法辖区的任何人发布或传播。</w:t>
             </w:r>
           </w:p>
-          <w:p/>
+          <w:p>
+            <w:pPr>
+              <w:rPr>
+                <w:rFonts w:hint="eastAsia"/>
+              </w:rPr>
+            </w:pPr>
+          </w:p>
         </w:tc>
       </w:tr>
     </w:tbl>
-    <w:p/>
+    <w:p>
+      <w:pPr>
+        <w:rPr>
+          <w:rFonts w:hint="eastAsia"/>
+        </w:rPr>
+      </w:pPr>
+    </w:p>
     <w:sectPr>
       <w:pgSz w:w="11906" w:h="16838"/>
       <w:pgMar w:top="720" w:right="720" w:bottom="720" w:left="720" w:header="283" w:footer="283" w:gutter="0"/>
@@ -3278,9 +3353,14 @@
 </file>
 
 <file path=word/endnotes.xml><?xml version="1.0" encoding="utf-8"?>
-<w:endnotes xmlns:wpc="http://schemas.microsoft.com/office/word/2010/wordprocessingCanvas" xmlns:cx="http://schemas.microsoft.com/office/drawing/2014/chartex" xmlns:cx1="http://schemas.microsoft.com/office/drawing/2015/9/8/chartex" xmlns:cx2="http://schemas.microsoft.com/office/drawing/2015/10/21/chartex" xmlns:cx3="http://schemas.microsoft.com/office/drawing/2016/5/9/chartex" xmlns:cx4="http://schemas.microsoft.com/office/drawing/2016/5/10/chartex" xmlns:cx5="http://schemas.microsoft.com/office/drawing/2016/5/11/chartex" xmlns:cx6="http://schemas.microsoft.com/office/drawing/2016/5/12/chartex" xmlns:cx7="http://schemas.microsoft.com/office/drawing/2016/5/13/chartex" xmlns:cx8="http://schemas.microsoft.com/office/drawing/2016/5/14/chartex" xmlns:mc="http://schemas.openxmlformats.org/markup-compatibility/2006" xmlns:aink="http://schemas.microsoft.com/office/drawing/2016/ink" xmlns:am3d="http://schemas.microsoft.com/office/drawing/2017/model3d" xmlns:o="urn:schemas-microsoft-com:office:office" xmlns:r="http://schemas.openxmlformats.org/officeDocument/2006/relationships" xmlns:m="http://schemas.openxmlformats.org/officeDocument/2006/math" xmlns:v="urn:schemas-microsoft-com:vml" xmlns:wp14="http://schemas.microsoft.com/office/word/2010/wordprocessingDrawing" xmlns:wp="http://schemas.openxmlformats.org/drawingml/2006/wordprocessingDrawing" xmlns:w10="urn:schemas-microsoft-com:office:word" xmlns:w="http://schemas.openxmlformats.org/wordprocessingml/2006/main" xmlns:w14="http://schemas.microsoft.com/office/word/2010/wordml" xmlns:w15="http://schemas.microsoft.com/office/word/2012/wordml" xmlns:w16cex="http://schemas.microsoft.com/office/word/2018/wordml/cex" xmlns:w16cid="http://schemas.microsoft.com/office/word/2016/wordml/cid" xmlns:w16="http://schemas.microsoft.com/office/word/2018/wordml" xmlns:w16sdtdh="http://schemas.microsoft.com/office/word/2020/wordml/sdtdatahash" xmlns:w16se="http://schemas.microsoft.com/office/word/2015/wordml/symex" xmlns:wpg="http://schemas.microsoft.com/office/word/2010/wordprocessingGroup" xmlns:wpi="http://schemas.microsoft.com/office/word/2010/wordprocessingInk" xmlns:wne="http://schemas.microsoft.com/office/word/2006/wordml" xmlns:wps="http://schemas.microsoft.com/office/word/2010/wordprocessingShape" mc:Ignorable="w14 w15 w16se w16cid w16 w16cex w16sdtdh wp14">
+<w:endnotes xmlns:wpc="http://schemas.microsoft.com/office/word/2010/wordprocessingCanvas" xmlns:cx="http://schemas.microsoft.com/office/drawing/2014/chartex" xmlns:cx1="http://schemas.microsoft.com/office/drawing/2015/9/8/chartex" xmlns:cx2="http://schemas.microsoft.com/office/drawing/2015/10/21/chartex" xmlns:cx3="http://schemas.microsoft.com/office/drawing/2016/5/9/chartex" xmlns:cx4="http://schemas.microsoft.com/office/drawing/2016/5/10/chartex" xmlns:cx5="http://schemas.microsoft.com/office/drawing/2016/5/11/chartex" xmlns:cx6="http://schemas.microsoft.com/office/drawing/2016/5/12/chartex" xmlns:cx7="http://schemas.microsoft.com/office/drawing/2016/5/13/chartex" xmlns:cx8="http://schemas.microsoft.com/office/drawing/2016/5/14/chartex" xmlns:mc="http://schemas.openxmlformats.org/markup-compatibility/2006" xmlns:aink="http://schemas.microsoft.com/office/drawing/2016/ink" xmlns:am3d="http://schemas.microsoft.com/office/drawing/2017/model3d" xmlns:o="urn:schemas-microsoft-com:office:office" xmlns:oel="http://schemas.microsoft.com/office/2019/extlst" xmlns:r="http://schemas.openxmlformats.org/officeDocument/2006/relationships" xmlns:m="http://schemas.openxmlformats.org/officeDocument/2006/math" xmlns:v="urn:schemas-microsoft-com:vml" xmlns:wp14="http://schemas.microsoft.com/office/word/2010/wordprocessingDrawing" xmlns:wp="http://schemas.openxmlformats.org/drawingml/2006/wordprocessingDrawing" xmlns:w10="urn:schemas-microsoft-com:office:word" xmlns:w="http://schemas.openxmlformats.org/wordprocessingml/2006/main" xmlns:w14="http://schemas.microsoft.com/office/word/2010/wordml" xmlns:w15="http://schemas.microsoft.com/office/word/2012/wordml" xmlns:w16cex="http://schemas.microsoft.com/office/word/2018/wordml/cex" xmlns:w16cid="http://schemas.microsoft.com/office/word/2016/wordml/cid" xmlns:w16="http://schemas.microsoft.com/office/word/2018/wordml" xmlns:w16du="http://schemas.microsoft.com/office/word/2023/wordml/word16du" xmlns:w16sdtdh="http://schemas.microsoft.com/office/word/2020/wordml/sdtdatahash" xmlns:w16sdtfl="http://schemas.microsoft.com/office/word/2024/wordml/sdtformatlock" xmlns:w16se="http://schemas.microsoft.com/office/word/2015/wordml/symex" xmlns:wpg="http://schemas.microsoft.com/office/word/2010/wordprocessingGroup" xmlns:wpi="http://schemas.microsoft.com/office/word/2010/wordprocessingInk" xmlns:wne="http://schemas.microsoft.com/office/word/2006/wordml" xmlns:wps="http://schemas.microsoft.com/office/word/2010/wordprocessingShape" mc:Ignorable="w14 w15 w16se w16cid w16 w16cex w16sdtdh w16sdtfl w16du wp14">
   <w:endnote w:type="separator" w:id="-1">
     <w:p>
+      <w:pPr>
+        <w:rPr>
+          <w:rFonts w:hint="eastAsia"/>
+        </w:rPr>
+      </w:pPr>
       <w:r>
         <w:separator/>
       </w:r>
@@ -3288,6 +3368,11 @@
   </w:endnote>
   <w:endnote w:type="continuationSeparator" w:id="0">
     <w:p>
+      <w:pPr>
+        <w:rPr>
+          <w:rFonts w:hint="eastAsia"/>
+        </w:rPr>
+      </w:pPr>
       <w:r>
         <w:continuationSeparator/>
       </w:r>
@@ -3297,9 +3382,14 @@
 </file>
 
 <file path=word/footnotes.xml><?xml version="1.0" encoding="utf-8"?>
-<w:footnotes xmlns:wpc="http://schemas.microsoft.com/office/word/2010/wordprocessingCanvas" xmlns:cx="http://schemas.microsoft.com/office/drawing/2014/chartex" xmlns:cx1="http://schemas.microsoft.com/office/drawing/2015/9/8/chartex" xmlns:cx2="http://schemas.microsoft.com/office/drawing/2015/10/21/chartex" xmlns:cx3="http://schemas.microsoft.com/office/drawing/2016/5/9/chartex" xmlns:cx4="http://schemas.microsoft.com/office/drawing/2016/5/10/chartex" xmlns:cx5="http://schemas.microsoft.com/office/drawing/2016/5/11/chartex" xmlns:cx6="http://schemas.microsoft.com/office/drawing/2016/5/12/chartex" xmlns:cx7="http://schemas.microsoft.com/office/drawing/2016/5/13/chartex" xmlns:cx8="http://schemas.microsoft.com/office/drawing/2016/5/14/chartex" xmlns:mc="http://schemas.openxmlformats.org/markup-compatibility/2006" xmlns:aink="http://schemas.microsoft.com/office/drawing/2016/ink" xmlns:am3d="http://schemas.microsoft.com/office/drawing/2017/model3d" xmlns:o="urn:schemas-microsoft-com:office:office" xmlns:r="http://schemas.openxmlformats.org/officeDocument/2006/relationships" xmlns:m="http://schemas.openxmlformats.org/officeDocument/2006/math" xmlns:v="urn:schemas-microsoft-com:vml" xmlns:wp14="http://schemas.microsoft.com/office/word/2010/wordprocessingDrawing" xmlns:wp="http://schemas.openxmlformats.org/drawingml/2006/wordprocessingDrawing" xmlns:w10="urn:schemas-microsoft-com:office:word" xmlns:w="http://schemas.openxmlformats.org/wordprocessingml/2006/main" xmlns:w14="http://schemas.microsoft.com/office/word/2010/wordml" xmlns:w15="http://schemas.microsoft.com/office/word/2012/wordml" xmlns:w16cex="http://schemas.microsoft.com/office/word/2018/wordml/cex" xmlns:w16cid="http://schemas.microsoft.com/office/word/2016/wordml/cid" xmlns:w16="http://schemas.microsoft.com/office/word/2018/wordml" xmlns:w16sdtdh="http://schemas.microsoft.com/office/word/2020/wordml/sdtdatahash" xmlns:w16se="http://schemas.microsoft.com/office/word/2015/wordml/symex" xmlns:wpg="http://schemas.microsoft.com/office/word/2010/wordprocessingGroup" xmlns:wpi="http://schemas.microsoft.com/office/word/2010/wordprocessingInk" xmlns:wne="http://schemas.microsoft.com/office/word/2006/wordml" xmlns:wps="http://schemas.microsoft.com/office/word/2010/wordprocessingShape" mc:Ignorable="w14 w15 w16se w16cid w16 w16cex w16sdtdh wp14">
+<w:footnotes xmlns:wpc="http://schemas.microsoft.com/office/word/2010/wordprocessingCanvas" xmlns:cx="http://schemas.microsoft.com/office/drawing/2014/chartex" xmlns:cx1="http://schemas.microsoft.com/office/drawing/2015/9/8/chartex" xmlns:cx2="http://schemas.microsoft.com/office/drawing/2015/10/21/chartex" xmlns:cx3="http://schemas.microsoft.com/office/drawing/2016/5/9/chartex" xmlns:cx4="http://schemas.microsoft.com/office/drawing/2016/5/10/chartex" xmlns:cx5="http://schemas.microsoft.com/office/drawing/2016/5/11/chartex" xmlns:cx6="http://schemas.microsoft.com/office/drawing/2016/5/12/chartex" xmlns:cx7="http://schemas.microsoft.com/office/drawing/2016/5/13/chartex" xmlns:cx8="http://schemas.microsoft.com/office/drawing/2016/5/14/chartex" xmlns:mc="http://schemas.openxmlformats.org/markup-compatibility/2006" xmlns:aink="http://schemas.microsoft.com/office/drawing/2016/ink" xmlns:am3d="http://schemas.microsoft.com/office/drawing/2017/model3d" xmlns:o="urn:schemas-microsoft-com:office:office" xmlns:oel="http://schemas.microsoft.com/office/2019/extlst" xmlns:r="http://schemas.openxmlformats.org/officeDocument/2006/relationships" xmlns:m="http://schemas.openxmlformats.org/officeDocument/2006/math" xmlns:v="urn:schemas-microsoft-com:vml" xmlns:wp14="http://schemas.microsoft.com/office/word/2010/wordprocessingDrawing" xmlns:wp="http://schemas.openxmlformats.org/drawingml/2006/wordprocessingDrawing" xmlns:w10="urn:schemas-microsoft-com:office:word" xmlns:w="http://schemas.openxmlformats.org/wordprocessingml/2006/main" xmlns:w14="http://schemas.microsoft.com/office/word/2010/wordml" xmlns:w15="http://schemas.microsoft.com/office/word/2012/wordml" xmlns:w16cex="http://schemas.microsoft.com/office/word/2018/wordml/cex" xmlns:w16cid="http://schemas.microsoft.com/office/word/2016/wordml/cid" xmlns:w16="http://schemas.microsoft.com/office/word/2018/wordml" xmlns:w16du="http://schemas.microsoft.com/office/word/2023/wordml/word16du" xmlns:w16sdtdh="http://schemas.microsoft.com/office/word/2020/wordml/sdtdatahash" xmlns:w16sdtfl="http://schemas.microsoft.com/office/word/2024/wordml/sdtformatlock" xmlns:w16se="http://schemas.microsoft.com/office/word/2015/wordml/symex" xmlns:wpg="http://schemas.microsoft.com/office/word/2010/wordprocessingGroup" xmlns:wpi="http://schemas.microsoft.com/office/word/2010/wordprocessingInk" xmlns:wne="http://schemas.microsoft.com/office/word/2006/wordml" xmlns:wps="http://schemas.microsoft.com/office/word/2010/wordprocessingShape" mc:Ignorable="w14 w15 w16se w16cid w16 w16cex w16sdtdh w16sdtfl w16du wp14">
   <w:footnote w:type="separator" w:id="-1">
     <w:p>
+      <w:pPr>
+        <w:rPr>
+          <w:rFonts w:hint="eastAsia"/>
+        </w:rPr>
+      </w:pPr>
       <w:r>
         <w:separator/>
       </w:r>
@@ -3307,6 +3397,11 @@
   </w:footnote>
   <w:footnote w:type="continuationSeparator" w:id="0">
     <w:p>
+      <w:pPr>
+        <w:rPr>
+          <w:rFonts w:hint="eastAsia"/>
+        </w:rPr>
+      </w:pPr>
       <w:r>
         <w:continuationSeparator/>
       </w:r>
@@ -3316,7 +3411,7 @@
 </file>
 
 <file path=word/styles.xml><?xml version="1.0" encoding="utf-8"?>
-<w:styles xmlns:mc="http://schemas.openxmlformats.org/markup-compatibility/2006" xmlns:r="http://schemas.openxmlformats.org/officeDocument/2006/relationships" xmlns:w="http://schemas.openxmlformats.org/wordprocessingml/2006/main" xmlns:w14="http://schemas.microsoft.com/office/word/2010/wordml" xmlns:w15="http://schemas.microsoft.com/office/word/2012/wordml" xmlns:w16cex="http://schemas.microsoft.com/office/word/2018/wordml/cex" xmlns:w16cid="http://schemas.microsoft.com/office/word/2016/wordml/cid" xmlns:w16="http://schemas.microsoft.com/office/word/2018/wordml" xmlns:w16sdtdh="http://schemas.microsoft.com/office/word/2020/wordml/sdtdatahash" xmlns:w16se="http://schemas.microsoft.com/office/word/2015/wordml/symex" mc:Ignorable="w14 w15 w16se w16cid w16 w16cex w16sdtdh">
+<w:styles xmlns:mc="http://schemas.openxmlformats.org/markup-compatibility/2006" xmlns:r="http://schemas.openxmlformats.org/officeDocument/2006/relationships" xmlns:w="http://schemas.openxmlformats.org/wordprocessingml/2006/main" xmlns:w14="http://schemas.microsoft.com/office/word/2010/wordml" xmlns:w15="http://schemas.microsoft.com/office/word/2012/wordml" xmlns:w16cex="http://schemas.microsoft.com/office/word/2018/wordml/cex" xmlns:w16cid="http://schemas.microsoft.com/office/word/2016/wordml/cid" xmlns:w16="http://schemas.microsoft.com/office/word/2018/wordml" xmlns:w16du="http://schemas.microsoft.com/office/word/2023/wordml/word16du" xmlns:w16sdtdh="http://schemas.microsoft.com/office/word/2020/wordml/sdtdatahash" xmlns:w16sdtfl="http://schemas.microsoft.com/office/word/2024/wordml/sdtformatlock" xmlns:w16se="http://schemas.microsoft.com/office/word/2015/wordml/symex" mc:Ignorable="w14 w15 w16se w16cid w16 w16cex w16sdtdh w16sdtfl w16du">
   <w:docDefaults>
     <w:rPrDefault>
       <w:rPr>

</xml_diff>